<commit_message>
Quinta Versão - Parte 03
</commit_message>
<xml_diff>
--- a/docs/tarefa_site_tia_portal.docx
+++ b/docs/tarefa_site_tia_portal.docx
@@ -1,90 +1,211 @@
 
 <file path=word/document.xml><?xml version="1.0" encoding="utf-8"?>
-<w:document xmlns:wpc="http://schemas.microsoft.com/office/word/2010/wordprocessingCanvas" xmlns:cx="http://schemas.microsoft.com/office/drawing/2014/chartex" xmlns:cx1="http://schemas.microsoft.com/office/drawing/2015/9/8/chartex" xmlns:cx2="http://schemas.microsoft.com/office/drawing/2015/10/21/chartex" xmlns:cx3="http://schemas.microsoft.com/office/drawing/2016/5/9/chartex" xmlns:cx4="http://schemas.microsoft.com/office/drawing/2016/5/10/chartex" xmlns:cx5="http://schemas.microsoft.com/office/drawing/2016/5/11/chartex" xmlns:cx6="http://schemas.microsoft.com/office/drawing/2016/5/12/chartex" xmlns:cx7="http://schemas.microsoft.com/office/drawing/2016/5/13/chartex" xmlns:cx8="http://schemas.microsoft.com/office/drawing/2016/5/14/chartex" xmlns:mc="http://schemas.openxmlformats.org/markup-compatibility/2006" xmlns:aink="http://schemas.microsoft.com/office/drawing/2016/ink" xmlns:am3d="http://schemas.microsoft.com/office/drawing/2017/model3d" xmlns:o="urn:schemas-microsoft-com:office:office" xmlns:oel="http://schemas.microsoft.com/office/2019/extlst" xmlns:r="http://schemas.openxmlformats.org/officeDocument/2006/relationships" xmlns:m="http://schemas.openxmlformats.org/officeDocument/2006/math" xmlns:v="urn:schemas-microsoft-com:vml" xmlns:wp14="http://schemas.microsoft.com/office/word/2010/wordprocessingDrawing" xmlns:wp="http://schemas.openxmlformats.org/drawingml/2006/wordprocessingDrawing" xmlns:w10="urn:schemas-microsoft-com:office:word" xmlns:w="http://schemas.openxmlformats.org/wordprocessingml/2006/main" xmlns:w14="http://schemas.microsoft.com/office/word/2010/wordml" xmlns:w15="http://schemas.microsoft.com/office/word/2012/wordml" xmlns:w16cex="http://schemas.microsoft.com/office/word/2018/wordml/cex" xmlns:w16cid="http://schemas.microsoft.com/office/word/2016/wordml/cid" xmlns:w16="http://schemas.microsoft.com/office/word/2018/wordml" xmlns:w16sdtdh="http://schemas.microsoft.com/office/word/2020/wordml/sdtdatahash" xmlns:w16se="http://schemas.microsoft.com/office/word/2015/wordml/symex" xmlns:wpg="http://schemas.microsoft.com/office/word/2010/wordprocessingGroup" xmlns:wpi="http://schemas.microsoft.com/office/word/2010/wordprocessingInk" xmlns:wne="http://schemas.microsoft.com/office/word/2006/wordml" xmlns:wps="http://schemas.microsoft.com/office/word/2010/wordprocessingShape" mc:Ignorable="w14 w15 w16se w16cid w16 w16cex w16sdtdh wp14">
+<w:document xmlns:wpc="http://schemas.microsoft.com/office/word/2010/wordprocessingCanvas" xmlns:cx="http://schemas.microsoft.com/office/drawing/2014/chartex" xmlns:cx1="http://schemas.microsoft.com/office/drawing/2015/9/8/chartex" xmlns:cx2="http://schemas.microsoft.com/office/drawing/2015/10/21/chartex" xmlns:cx3="http://schemas.microsoft.com/office/drawing/2016/5/9/chartex" xmlns:cx4="http://schemas.microsoft.com/office/drawing/2016/5/10/chartex" xmlns:cx5="http://schemas.microsoft.com/office/drawing/2016/5/11/chartex" xmlns:cx6="http://schemas.microsoft.com/office/drawing/2016/5/12/chartex" xmlns:cx7="http://schemas.microsoft.com/office/drawing/2016/5/13/chartex" xmlns:cx8="http://schemas.microsoft.com/office/drawing/2016/5/14/chartex" xmlns:mc="http://schemas.openxmlformats.org/markup-compatibility/2006" xmlns:aink="http://schemas.microsoft.com/office/drawing/2016/ink" xmlns:am3d="http://schemas.microsoft.com/office/drawing/2017/model3d" xmlns:o="urn:schemas-microsoft-com:office:office" xmlns:oel="http://schemas.microsoft.com/office/2019/extlst" xmlns:r="http://schemas.openxmlformats.org/officeDocument/2006/relationships" xmlns:m="http://schemas.openxmlformats.org/officeDocument/2006/math" xmlns:v="urn:schemas-microsoft-com:vml" xmlns:wp14="http://schemas.microsoft.com/office/word/2010/wordprocessingDrawing" xmlns:wp="http://schemas.openxmlformats.org/drawingml/2006/wordprocessingDrawing" xmlns:w10="urn:schemas-microsoft-com:office:word" xmlns:w="http://schemas.openxmlformats.org/wordprocessingml/2006/main" xmlns:w14="http://schemas.microsoft.com/office/word/2010/wordml" xmlns:w15="http://schemas.microsoft.com/office/word/2012/wordml" xmlns:w16cex="http://schemas.microsoft.com/office/word/2018/wordml/cex" xmlns:w16cid="http://schemas.microsoft.com/office/word/2016/wordml/cid" xmlns:w16="http://schemas.microsoft.com/office/word/2018/wordml" xmlns:w16du="http://schemas.microsoft.com/office/word/2023/wordml/word16du" xmlns:w16sdtdh="http://schemas.microsoft.com/office/word/2020/wordml/sdtdatahash" xmlns:w16sdtfl="http://schemas.microsoft.com/office/word/2024/wordml/sdtformatlock" xmlns:w16se="http://schemas.microsoft.com/office/word/2015/wordml/symex" xmlns:wpg="http://schemas.microsoft.com/office/word/2010/wordprocessingGroup" xmlns:wpi="http://schemas.microsoft.com/office/word/2010/wordprocessingInk" xmlns:wne="http://schemas.microsoft.com/office/word/2006/wordml" xmlns:wps="http://schemas.microsoft.com/office/word/2010/wordprocessingShape" mc:Ignorable="w14 w15 w16se w16cid w16 w16cex w16sdtdh w16sdtfl w16du wp14">
   <w:body>
     <w:p>
       <w:pPr>
+        <w:spacing w:after="0" w:line="240" w:lineRule="auto"/>
         <w:jc w:val="center"/>
         <w:rPr>
-          <w:sz w:val="40"/>
-          <w:szCs w:val="40"/>
-        </w:rPr>
-      </w:pPr>
-      <w:r>
-        <w:rPr>
+          <w:rFonts w:ascii="Arial" w:hAnsi="Arial" w:cs="Arial"/>
           <w:b/>
           <w:bCs/>
           <w:sz w:val="40"/>
           <w:szCs w:val="40"/>
         </w:rPr>
-        <w:t>Tarefa</w:t>
-      </w:r>
-      <w:r>
-        <w:rPr>
+      </w:pPr>
+      <w:r>
+        <w:rPr>
+          <w:rFonts w:ascii="Arial" w:hAnsi="Arial" w:cs="Arial"/>
           <w:b/>
           <w:bCs/>
           <w:sz w:val="40"/>
           <w:szCs w:val="40"/>
         </w:rPr>
-        <w:t xml:space="preserve"> Site – (TIA Portal V20)</w:t>
-      </w:r>
-    </w:p>
-    <w:p>
-      <w:pPr>
-        <w:spacing w:after="0" w:line="240" w:lineRule="auto"/>
-        <w:jc w:val="both"/>
-      </w:pPr>
-    </w:p>
-    <w:p>
-      <w:pPr>
-        <w:spacing w:after="0" w:line="240" w:lineRule="auto"/>
-        <w:jc w:val="both"/>
-      </w:pPr>
-      <w:r>
-        <w:t>Explicar com minhas palavras (</w:t>
-      </w:r>
-      <w:r>
-        <w:t xml:space="preserve">+ </w:t>
-      </w:r>
-      <w:r>
-        <w:t>Prints do programa Ladder):</w:t>
-      </w:r>
-    </w:p>
-    <w:p>
-      <w:pPr>
-        <w:spacing w:after="0" w:line="240" w:lineRule="auto"/>
-        <w:jc w:val="both"/>
-      </w:pPr>
-    </w:p>
-    <w:p>
-      <w:pPr>
-        <w:spacing w:after="0" w:line="240" w:lineRule="auto"/>
-        <w:jc w:val="both"/>
-      </w:pPr>
-    </w:p>
-    <w:p>
-      <w:pPr>
-        <w:spacing w:after="0" w:line="240" w:lineRule="auto"/>
-        <w:jc w:val="both"/>
-        <w:rPr>
+        <w:t>Tarefa Site – (TIA Portal V20)</w:t>
+      </w:r>
+    </w:p>
+    <w:p>
+      <w:pPr>
+        <w:pBdr>
+          <w:bottom w:val="single" w:sz="6" w:space="1" w:color="auto"/>
+        </w:pBdr>
+        <w:spacing w:after="0" w:line="240" w:lineRule="auto"/>
+        <w:jc w:val="center"/>
+        <w:rPr>
+          <w:rFonts w:ascii="Arial" w:hAnsi="Arial" w:cs="Arial"/>
+          <w:b/>
+          <w:bCs/>
+          <w:sz w:val="40"/>
+          <w:szCs w:val="40"/>
+        </w:rPr>
+      </w:pPr>
+    </w:p>
+    <w:p>
+      <w:pPr>
+        <w:spacing w:after="0" w:line="240" w:lineRule="auto"/>
+        <w:rPr>
+          <w:rFonts w:ascii="Arial" w:hAnsi="Arial" w:cs="Arial"/>
+        </w:rPr>
+      </w:pPr>
+    </w:p>
+    <w:p>
+      <w:pPr>
+        <w:spacing w:after="0" w:line="240" w:lineRule="auto"/>
+        <w:jc w:val="both"/>
+        <w:rPr>
+          <w:rFonts w:ascii="Arial" w:hAnsi="Arial" w:cs="Arial"/>
+          <w:b/>
+          <w:bCs/>
+          <w:i/>
+          <w:iCs/>
+          <w:u w:val="single"/>
+        </w:rPr>
+      </w:pPr>
+      <w:r>
+        <w:rPr>
+          <w:rFonts w:ascii="Arial" w:hAnsi="Arial" w:cs="Arial"/>
+          <w:b/>
+          <w:bCs/>
+          <w:i/>
+          <w:iCs/>
+          <w:u w:val="single"/>
+        </w:rPr>
+        <w:t xml:space="preserve">Explicar (+ Prints do programa Ladder): </w:t>
+      </w:r>
+    </w:p>
+    <w:p>
+      <w:pPr>
+        <w:spacing w:after="0" w:line="240" w:lineRule="auto"/>
+        <w:jc w:val="both"/>
+        <w:rPr>
+          <w:rFonts w:ascii="Arial" w:hAnsi="Arial" w:cs="Arial"/>
+          <w:b/>
+          <w:bCs/>
+          <w:i/>
+          <w:iCs/>
+          <w:u w:val="single"/>
+        </w:rPr>
+      </w:pPr>
+    </w:p>
+    <w:p>
+      <w:pPr>
+        <w:pStyle w:val="PargrafodaLista"/>
+        <w:numPr>
+          <w:ilvl w:val="0"/>
+          <w:numId w:val="13"/>
+        </w:numPr>
+        <w:spacing w:after="0" w:line="240" w:lineRule="auto"/>
+        <w:jc w:val="both"/>
+        <w:rPr>
+          <w:rFonts w:ascii="Arial" w:hAnsi="Arial" w:cs="Arial"/>
+        </w:rPr>
+      </w:pPr>
+      <w:r>
+        <w:rPr>
+          <w:rFonts w:ascii="Arial" w:hAnsi="Arial" w:cs="Arial"/>
           <w:b/>
           <w:bCs/>
           <w:u w:val="single"/>
         </w:rPr>
-      </w:pPr>
-      <w:r>
-        <w:rPr>
+        <w:t>Contato NA em Ladder</w:t>
+      </w:r>
+      <w:r>
+        <w:rPr>
+          <w:rFonts w:ascii="Arial" w:hAnsi="Arial" w:cs="Arial"/>
           <w:b/>
           <w:bCs/>
           <w:u w:val="single"/>
         </w:rPr>
-        <w:t>Programa sem temporizador:</w:t>
-      </w:r>
-    </w:p>
-    <w:p>
-      <w:pPr>
-        <w:spacing w:after="0" w:line="240" w:lineRule="auto"/>
-        <w:jc w:val="both"/>
+        <w:t>:</w:t>
+      </w:r>
+      <w:r>
+        <w:rPr>
+          <w:rFonts w:ascii="Arial" w:hAnsi="Arial" w:cs="Arial"/>
+        </w:rPr>
+        <w:t xml:space="preserve"> </w:t>
+      </w:r>
+      <w:r>
+        <w:rPr>
+          <w:rFonts w:ascii="Arial" w:hAnsi="Arial" w:cs="Arial"/>
+        </w:rPr>
+        <w:t>O Contato NA (Normalmente Aberto) — ou NO (</w:t>
+      </w:r>
+      <w:proofErr w:type="spellStart"/>
+      <w:r>
+        <w:rPr>
+          <w:rFonts w:ascii="Arial" w:hAnsi="Arial" w:cs="Arial"/>
+        </w:rPr>
+        <w:t>Normally</w:t>
+      </w:r>
+      <w:proofErr w:type="spellEnd"/>
+      <w:r>
+        <w:rPr>
+          <w:rFonts w:ascii="Arial" w:hAnsi="Arial" w:cs="Arial"/>
+        </w:rPr>
+        <w:t xml:space="preserve"> Open) — funciona como um interruptor onde, enquanto em repouso (Desativado - 0) impede a passagem de corrente; e ao ser acionado (Ativado) ele fecha o contato, permitindo assim a passagem da corrente. Sendo que para voltar a seu estado de repouso (Desativado - 0), o sinal de acionamento deve ser removido.</w:t>
+      </w:r>
+    </w:p>
+    <w:p>
+      <w:pPr>
+        <w:pStyle w:val="PargrafodaLista"/>
+        <w:spacing w:after="0" w:line="240" w:lineRule="auto"/>
+        <w:jc w:val="both"/>
+        <w:rPr>
+          <w:rFonts w:ascii="Arial" w:hAnsi="Arial" w:cs="Arial"/>
+        </w:rPr>
+      </w:pPr>
+    </w:p>
+    <w:p>
+      <w:pPr>
+        <w:pStyle w:val="PargrafodaLista"/>
+        <w:spacing w:after="0" w:line="240" w:lineRule="auto"/>
+        <w:jc w:val="both"/>
+        <w:rPr>
+          <w:rFonts w:ascii="Arial" w:hAnsi="Arial" w:cs="Arial"/>
+        </w:rPr>
+      </w:pPr>
+      <w:r>
+        <w:rPr>
+          <w:rFonts w:ascii="Arial" w:hAnsi="Arial" w:cs="Arial"/>
+        </w:rPr>
+        <w:t xml:space="preserve">Seu respectivo símbolo é:   </w:t>
+      </w:r>
+      <w:proofErr w:type="gramStart"/>
+      <w:r>
+        <w:rPr>
+          <w:rFonts w:ascii="Arial" w:hAnsi="Arial" w:cs="Arial"/>
+        </w:rPr>
+        <w:t>|  |</w:t>
+      </w:r>
+      <w:proofErr w:type="gramEnd"/>
+      <w:r>
+        <w:rPr>
+          <w:rFonts w:ascii="Arial" w:hAnsi="Arial" w:cs="Arial"/>
+        </w:rPr>
+        <w:t xml:space="preserve"> </w:t>
+      </w:r>
+    </w:p>
+    <w:p>
+      <w:pPr>
+        <w:pBdr>
+          <w:bottom w:val="single" w:sz="6" w:space="1" w:color="auto"/>
+        </w:pBdr>
+        <w:spacing w:after="0" w:line="240" w:lineRule="auto"/>
+        <w:jc w:val="both"/>
+        <w:rPr>
+          <w:rFonts w:ascii="Arial" w:hAnsi="Arial" w:cs="Arial"/>
+        </w:rPr>
+      </w:pPr>
+    </w:p>
+    <w:p>
+      <w:pPr>
+        <w:pStyle w:val="PargrafodaLista"/>
+        <w:spacing w:after="0" w:line="240" w:lineRule="auto"/>
+        <w:jc w:val="both"/>
+        <w:rPr>
+          <w:rFonts w:ascii="Arial" w:hAnsi="Arial" w:cs="Arial"/>
+        </w:rPr>
       </w:pPr>
     </w:p>
     <w:p>
@@ -92,44 +213,103 @@
         <w:pStyle w:val="PargrafodaLista"/>
         <w:numPr>
           <w:ilvl w:val="0"/>
-          <w:numId w:val="11"/>
+          <w:numId w:val="13"/>
         </w:numPr>
         <w:spacing w:after="0" w:line="240" w:lineRule="auto"/>
         <w:jc w:val="both"/>
         <w:rPr>
+          <w:rFonts w:ascii="Arial" w:hAnsi="Arial" w:cs="Arial"/>
+        </w:rPr>
+      </w:pPr>
+      <w:r>
+        <w:rPr>
+          <w:rFonts w:ascii="Arial" w:hAnsi="Arial" w:cs="Arial"/>
           <w:b/>
           <w:bCs/>
-        </w:rPr>
-      </w:pPr>
-      <w:r>
-        <w:rPr>
+          <w:u w:val="single"/>
+        </w:rPr>
+        <w:t>Contato NF em Ladder</w:t>
+      </w:r>
+      <w:r>
+        <w:rPr>
+          <w:rFonts w:ascii="Arial" w:hAnsi="Arial" w:cs="Arial"/>
+        </w:rPr>
+        <w:t xml:space="preserve">: </w:t>
+      </w:r>
+      <w:r>
+        <w:rPr>
+          <w:rFonts w:ascii="Arial" w:hAnsi="Arial" w:cs="Arial"/>
+        </w:rPr>
+        <w:t>O Contato NF (Normalmente Fechado) — ou NC (</w:t>
+      </w:r>
+      <w:proofErr w:type="spellStart"/>
+      <w:r>
+        <w:rPr>
+          <w:rFonts w:ascii="Arial" w:hAnsi="Arial" w:cs="Arial"/>
+        </w:rPr>
+        <w:t>Normally</w:t>
+      </w:r>
+      <w:proofErr w:type="spellEnd"/>
+      <w:r>
+        <w:rPr>
+          <w:rFonts w:ascii="Arial" w:hAnsi="Arial" w:cs="Arial"/>
+        </w:rPr>
+        <w:t xml:space="preserve"> Close) — é o oposto do Contato NA, pois funciona como um interruptor onde, enquanto em repouso (Desativado - 0) permite a passagem de corrente; e ao ser acionado (Ativado) ele abre o contato, impedindo assim a passagem da corrente. Sendo que para voltar a seu estado de repouso (Desativado - 0), o sinal de acionamento deve ser removido.</w:t>
+      </w:r>
+      <w:r>
+        <w:rPr>
+          <w:rFonts w:ascii="Arial" w:hAnsi="Arial" w:cs="Arial"/>
+        </w:rPr>
+        <w:t xml:space="preserve"> </w:t>
+      </w:r>
+    </w:p>
+    <w:p>
+      <w:pPr>
+        <w:pStyle w:val="PargrafodaLista"/>
+        <w:spacing w:after="0" w:line="240" w:lineRule="auto"/>
+        <w:jc w:val="both"/>
+        <w:rPr>
+          <w:rFonts w:ascii="Arial" w:hAnsi="Arial" w:cs="Arial"/>
           <w:b/>
           <w:bCs/>
-        </w:rPr>
-        <w:t>O</w:t>
-      </w:r>
-      <w:r>
-        <w:rPr>
-          <w:b/>
-          <w:bCs/>
-        </w:rPr>
-        <w:t xml:space="preserve"> que é o Contato NA em Ladder</w:t>
-      </w:r>
-      <w:r>
-        <w:rPr>
-          <w:b/>
-          <w:bCs/>
-        </w:rPr>
-        <w:t>?</w:t>
-      </w:r>
-    </w:p>
-    <w:p>
-      <w:pPr>
-        <w:spacing w:after="0" w:line="240" w:lineRule="auto"/>
-        <w:jc w:val="both"/>
-        <w:rPr>
-          <w:b/>
-          <w:bCs/>
+          <w:u w:val="single"/>
+        </w:rPr>
+      </w:pPr>
+    </w:p>
+    <w:p>
+      <w:pPr>
+        <w:pStyle w:val="PargrafodaLista"/>
+        <w:spacing w:after="0" w:line="240" w:lineRule="auto"/>
+        <w:jc w:val="both"/>
+        <w:rPr>
+          <w:rFonts w:ascii="Arial" w:hAnsi="Arial" w:cs="Arial"/>
+        </w:rPr>
+      </w:pPr>
+      <w:r>
+        <w:rPr>
+          <w:rFonts w:ascii="Arial" w:hAnsi="Arial" w:cs="Arial"/>
+        </w:rPr>
+        <w:t>Seu respectivo símbolo é:   | / |</w:t>
+      </w:r>
+    </w:p>
+    <w:p>
+      <w:pPr>
+        <w:pBdr>
+          <w:bottom w:val="single" w:sz="6" w:space="1" w:color="auto"/>
+        </w:pBdr>
+        <w:spacing w:after="0" w:line="240" w:lineRule="auto"/>
+        <w:jc w:val="both"/>
+        <w:rPr>
+          <w:rFonts w:ascii="Arial" w:hAnsi="Arial" w:cs="Arial"/>
+        </w:rPr>
+      </w:pPr>
+    </w:p>
+    <w:p>
+      <w:pPr>
+        <w:spacing w:after="0" w:line="240" w:lineRule="auto"/>
+        <w:jc w:val="both"/>
+        <w:rPr>
+          <w:rFonts w:ascii="Arial" w:hAnsi="Arial" w:cs="Arial"/>
         </w:rPr>
       </w:pPr>
     </w:p>
@@ -138,93 +318,84 @@
         <w:pStyle w:val="PargrafodaLista"/>
         <w:numPr>
           <w:ilvl w:val="0"/>
-          <w:numId w:val="11"/>
+          <w:numId w:val="13"/>
         </w:numPr>
         <w:spacing w:after="0" w:line="240" w:lineRule="auto"/>
         <w:jc w:val="both"/>
-      </w:pPr>
-      <w:r>
-        <w:t xml:space="preserve">R: </w:t>
-      </w:r>
-      <w:r>
-        <w:t xml:space="preserve">O Contato </w:t>
-      </w:r>
-      <w:r>
-        <w:rPr>
+        <w:rPr>
+          <w:rFonts w:ascii="Arial" w:hAnsi="Arial" w:cs="Arial"/>
+        </w:rPr>
+      </w:pPr>
+      <w:r>
+        <w:rPr>
+          <w:rFonts w:ascii="Arial" w:hAnsi="Arial" w:cs="Arial"/>
           <w:b/>
           <w:bCs/>
-        </w:rPr>
-        <w:t>NA (Normalmente Aberto)</w:t>
-      </w:r>
-      <w:r>
-        <w:t xml:space="preserve"> — ou </w:t>
-      </w:r>
-      <w:r>
-        <w:rPr>
+          <w:u w:val="single"/>
+        </w:rPr>
+        <w:t xml:space="preserve">TON (Timer </w:t>
+      </w:r>
+      <w:proofErr w:type="spellStart"/>
+      <w:r>
+        <w:rPr>
+          <w:rFonts w:ascii="Arial" w:hAnsi="Arial" w:cs="Arial"/>
           <w:b/>
           <w:bCs/>
-        </w:rPr>
-        <w:t>NO (Normally Open)</w:t>
-      </w:r>
-      <w:r>
-        <w:t xml:space="preserve"> —</w:t>
-      </w:r>
-      <w:r>
-        <w:t xml:space="preserve"> funciona como um interruptor onde, enquanto em repouso (Desativado - 0) impede a passagem de corrente; e ao ser acionado (Ativado – ao selecionar Modify to 1) ele fecha o contato, permitindo assim a passagem da corrente.</w:t>
-      </w:r>
-    </w:p>
-    <w:p>
-      <w:pPr>
-        <w:spacing w:after="0" w:line="240" w:lineRule="auto"/>
-        <w:ind w:left="708"/>
-        <w:jc w:val="both"/>
-      </w:pPr>
-      <w:r>
-        <w:t xml:space="preserve">Sendo que para voltar a seu estado de repouso </w:t>
-      </w:r>
-      <w:r>
-        <w:t>(Desativado - 0)</w:t>
-      </w:r>
-      <w:r>
-        <w:t xml:space="preserve"> deve-se selecionar </w:t>
-      </w:r>
-      <w:r>
-        <w:t xml:space="preserve">Modify to </w:t>
-      </w:r>
-      <w:r>
-        <w:t>0.</w:t>
-      </w:r>
-    </w:p>
-    <w:p>
-      <w:pPr>
-        <w:spacing w:after="0" w:line="240" w:lineRule="auto"/>
-        <w:jc w:val="both"/>
-      </w:pPr>
-    </w:p>
-    <w:p>
-      <w:pPr>
-        <w:spacing w:after="0" w:line="240" w:lineRule="auto"/>
-        <w:jc w:val="both"/>
-      </w:pPr>
-      <w:r>
-        <w:t xml:space="preserve">Seu respectivo símbolo é:   </w:t>
-      </w:r>
-      <w:proofErr w:type="gramStart"/>
-      <w:r>
-        <w:t>|  |</w:t>
-      </w:r>
-      <w:proofErr w:type="gramEnd"/>
-    </w:p>
-    <w:p>
-      <w:pPr>
-        <w:spacing w:after="0" w:line="240" w:lineRule="auto"/>
-        <w:jc w:val="both"/>
-      </w:pPr>
-    </w:p>
-    <w:p>
-      <w:pPr>
-        <w:spacing w:after="0" w:line="240" w:lineRule="auto"/>
-        <w:jc w:val="both"/>
+          <w:u w:val="single"/>
+        </w:rPr>
+        <w:t>On</w:t>
+      </w:r>
+      <w:proofErr w:type="spellEnd"/>
+      <w:r>
+        <w:rPr>
+          <w:rFonts w:ascii="Arial" w:hAnsi="Arial" w:cs="Arial"/>
+          <w:b/>
+          <w:bCs/>
+          <w:u w:val="single"/>
+        </w:rPr>
+        <w:t xml:space="preserve"> Delay - Atraso na Energização)</w:t>
+      </w:r>
+      <w:r>
+        <w:rPr>
+          <w:rFonts w:ascii="Arial" w:hAnsi="Arial" w:cs="Arial"/>
+          <w:b/>
+          <w:bCs/>
+          <w:u w:val="single"/>
+        </w:rPr>
+        <w:t>:</w:t>
+      </w:r>
+      <w:r>
+        <w:rPr>
+          <w:rFonts w:ascii="Arial" w:hAnsi="Arial" w:cs="Arial"/>
+        </w:rPr>
+        <w:t xml:space="preserve"> </w:t>
+      </w:r>
+      <w:r>
+        <w:rPr>
+          <w:rFonts w:ascii="Arial" w:hAnsi="Arial" w:cs="Arial"/>
+        </w:rPr>
+        <w:t>É um temporizador utilizado para esperar um número definido de segundos, milissegundos, etc... após ser energizado para permitir a passagem de energia após o Contato NA ser acionado ou NF ser mantido em seu estado.</w:t>
+      </w:r>
+    </w:p>
+    <w:p>
+      <w:pPr>
+        <w:pBdr>
+          <w:bottom w:val="single" w:sz="6" w:space="1" w:color="auto"/>
+        </w:pBdr>
+        <w:spacing w:after="0" w:line="240" w:lineRule="auto"/>
+        <w:jc w:val="both"/>
+        <w:rPr>
+          <w:rFonts w:ascii="Arial" w:hAnsi="Arial" w:cs="Arial"/>
+        </w:rPr>
+      </w:pPr>
+    </w:p>
+    <w:p>
+      <w:pPr>
+        <w:spacing w:after="0" w:line="240" w:lineRule="auto"/>
+        <w:jc w:val="both"/>
+        <w:rPr>
+          <w:rFonts w:ascii="Arial" w:hAnsi="Arial" w:cs="Arial"/>
+        </w:rPr>
       </w:pPr>
     </w:p>
     <w:p>
@@ -232,182 +403,140 @@
         <w:pStyle w:val="PargrafodaLista"/>
         <w:numPr>
           <w:ilvl w:val="0"/>
-          <w:numId w:val="11"/>
+          <w:numId w:val="13"/>
         </w:numPr>
         <w:spacing w:after="0" w:line="240" w:lineRule="auto"/>
         <w:jc w:val="both"/>
         <w:rPr>
+          <w:rFonts w:ascii="Arial" w:hAnsi="Arial" w:cs="Arial"/>
+        </w:rPr>
+      </w:pPr>
+      <w:r>
+        <w:rPr>
+          <w:rFonts w:ascii="Arial" w:hAnsi="Arial" w:cs="Arial"/>
           <w:b/>
           <w:bCs/>
-        </w:rPr>
-      </w:pPr>
-      <w:r>
-        <w:rPr>
-          <w:b/>
-          <w:bCs/>
-        </w:rPr>
-        <w:t>O que é o Contato NF em Ladder?</w:t>
-      </w:r>
+          <w:u w:val="single"/>
+        </w:rPr>
+        <w:t>TOF (Timer Off Delay - Atraso na Desenergização)</w:t>
+      </w:r>
+      <w:r>
+        <w:rPr>
+          <w:rFonts w:ascii="Arial" w:hAnsi="Arial" w:cs="Arial"/>
+        </w:rPr>
+        <w:t>:</w:t>
+      </w:r>
+      <w:r>
+        <w:rPr>
+          <w:rFonts w:ascii="Arial" w:hAnsi="Arial" w:cs="Arial"/>
+        </w:rPr>
+        <w:t xml:space="preserve"> </w:t>
+      </w:r>
+      <w:r>
+        <w:rPr>
+          <w:rFonts w:ascii="Arial" w:hAnsi="Arial" w:cs="Arial"/>
+        </w:rPr>
+        <w:t>É o oposto do TON, pois é um temporizador utilizado para esperar um número definido de segundos, milissegundos, etc... após ser desenergizado para impedir a passagem de energia após o Contato NA ser desativado ou NF ser acionado.</w:t>
+      </w:r>
+    </w:p>
+    <w:p>
+      <w:pPr>
+        <w:pBdr>
+          <w:bottom w:val="single" w:sz="6" w:space="1" w:color="auto"/>
+        </w:pBdr>
+        <w:spacing w:after="0" w:line="240" w:lineRule="auto"/>
+        <w:jc w:val="both"/>
+        <w:rPr>
+          <w:rFonts w:ascii="Arial" w:hAnsi="Arial" w:cs="Arial"/>
+        </w:rPr>
+      </w:pPr>
+    </w:p>
+    <w:p>
+      <w:pPr>
+        <w:spacing w:after="0" w:line="240" w:lineRule="auto"/>
+        <w:jc w:val="both"/>
+        <w:rPr>
+          <w:rFonts w:ascii="Arial" w:hAnsi="Arial" w:cs="Arial"/>
+        </w:rPr>
+      </w:pPr>
     </w:p>
     <w:p>
       <w:pPr>
         <w:pStyle w:val="PargrafodaLista"/>
         <w:numPr>
           <w:ilvl w:val="0"/>
-          <w:numId w:val="11"/>
+          <w:numId w:val="13"/>
         </w:numPr>
         <w:spacing w:after="0" w:line="240" w:lineRule="auto"/>
         <w:jc w:val="both"/>
-      </w:pPr>
-      <w:r>
-        <w:t>R:</w:t>
-      </w:r>
-      <w:r>
-        <w:t xml:space="preserve"> </w:t>
-      </w:r>
-      <w:r>
-        <w:t xml:space="preserve">O Contato </w:t>
-      </w:r>
-      <w:r>
-        <w:rPr>
+        <w:rPr>
+          <w:rFonts w:ascii="Arial" w:hAnsi="Arial" w:cs="Arial"/>
+        </w:rPr>
+      </w:pPr>
+      <w:r>
+        <w:rPr>
+          <w:rFonts w:ascii="Arial" w:hAnsi="Arial" w:cs="Arial"/>
           <w:b/>
           <w:bCs/>
-        </w:rPr>
-        <w:t>N</w:t>
-      </w:r>
-      <w:r>
-        <w:rPr>
+          <w:u w:val="single"/>
+        </w:rPr>
+        <w:t>Bobina Set em Ladder</w:t>
+      </w:r>
+      <w:r>
+        <w:rPr>
+          <w:rFonts w:ascii="Arial" w:hAnsi="Arial" w:cs="Arial"/>
           <w:b/>
           <w:bCs/>
-        </w:rPr>
-        <w:t>F</w:t>
-      </w:r>
-      <w:r>
-        <w:rPr>
-          <w:b/>
-          <w:bCs/>
-        </w:rPr>
-        <w:t xml:space="preserve"> (Normalmente </w:t>
-      </w:r>
-      <w:r>
-        <w:rPr>
-          <w:b/>
-          <w:bCs/>
-        </w:rPr>
-        <w:t>Fechado</w:t>
-      </w:r>
-      <w:r>
-        <w:rPr>
-          <w:b/>
-          <w:bCs/>
-        </w:rPr>
-        <w:t>)</w:t>
-      </w:r>
-      <w:r>
-        <w:t xml:space="preserve"> — ou </w:t>
-      </w:r>
-      <w:r>
-        <w:rPr>
-          <w:b/>
-          <w:bCs/>
-        </w:rPr>
-        <w:t>N</w:t>
-      </w:r>
-      <w:r>
-        <w:rPr>
-          <w:b/>
-          <w:bCs/>
-        </w:rPr>
-        <w:t>C</w:t>
-      </w:r>
-      <w:r>
-        <w:rPr>
-          <w:b/>
-          <w:bCs/>
-        </w:rPr>
-        <w:t xml:space="preserve"> (Normally </w:t>
-      </w:r>
-      <w:r>
-        <w:rPr>
-          <w:b/>
-          <w:bCs/>
-        </w:rPr>
-        <w:t>Close</w:t>
-      </w:r>
-      <w:r>
-        <w:rPr>
-          <w:b/>
-          <w:bCs/>
-        </w:rPr>
-        <w:t>)</w:t>
-      </w:r>
-      <w:r>
-        <w:t xml:space="preserve"> —</w:t>
-      </w:r>
-      <w:r>
+          <w:u w:val="single"/>
+        </w:rPr>
+        <w:t>:</w:t>
+      </w:r>
+      <w:r>
+        <w:rPr>
+          <w:rFonts w:ascii="Arial" w:hAnsi="Arial" w:cs="Arial"/>
+        </w:rPr>
         <w:t xml:space="preserve"> </w:t>
       </w:r>
       <w:r>
-        <w:t xml:space="preserve">é o oposto do Contato NA, pois </w:t>
-      </w:r>
-      <w:r>
-        <w:t xml:space="preserve">funciona como um interruptor onde, enquanto em repouso (Desativado - 0) </w:t>
-      </w:r>
-      <w:r>
-        <w:t>permite</w:t>
-      </w:r>
-      <w:r>
-        <w:t xml:space="preserve"> a passagem de corrente; e ao ser acionado (Ativado – ao selecionar Modify to 1) ele </w:t>
-      </w:r>
-      <w:r>
-        <w:t>abre</w:t>
-      </w:r>
-      <w:r>
-        <w:t xml:space="preserve"> o contato, </w:t>
-      </w:r>
-      <w:r>
-        <w:t>impedindo</w:t>
-      </w:r>
-      <w:r>
-        <w:t xml:space="preserve"> assim a passagem da corrente.</w:t>
-      </w:r>
-    </w:p>
-    <w:p>
-      <w:pPr>
-        <w:spacing w:after="0" w:line="240" w:lineRule="auto"/>
-        <w:ind w:left="708"/>
-        <w:jc w:val="both"/>
-      </w:pPr>
-      <w:r>
-        <w:t>Sendo que para voltar a seu estado de repouso (Desativado - 0) deve-se selecionar Modify to 0.</w:t>
-      </w:r>
-    </w:p>
-    <w:p>
-      <w:pPr>
-        <w:spacing w:after="0" w:line="240" w:lineRule="auto"/>
-        <w:jc w:val="both"/>
-      </w:pPr>
-    </w:p>
-    <w:p>
-      <w:pPr>
-        <w:spacing w:after="0" w:line="240" w:lineRule="auto"/>
-        <w:jc w:val="both"/>
-      </w:pPr>
-      <w:r>
-        <w:t>Seu respectivo símbolo é:   |</w:t>
-      </w:r>
-      <w:r>
-        <w:t xml:space="preserve"> / </w:t>
-      </w:r>
-      <w:r>
-        <w:t>|</w:t>
-      </w:r>
-    </w:p>
-    <w:p>
-      <w:pPr>
-        <w:spacing w:after="0" w:line="240" w:lineRule="auto"/>
-        <w:jc w:val="both"/>
-      </w:pPr>
+        <w:rPr>
+          <w:rFonts w:ascii="Arial" w:hAnsi="Arial" w:cs="Arial"/>
+        </w:rPr>
+        <w:t xml:space="preserve">É uma instrução de saída que, ao receber um pulso lógico ativo, ativa seu endereço e o mantém retido ("travado" em 1). Mesmo que o contato de entrada volte para o estado de repouso, a bobina permanece ligada até receber um comando de Reset. </w:t>
+      </w:r>
+    </w:p>
+    <w:p>
+      <w:pPr>
+        <w:pStyle w:val="PargrafodaLista"/>
+        <w:spacing w:after="0" w:line="240" w:lineRule="auto"/>
+        <w:jc w:val="both"/>
+        <w:rPr>
+          <w:rFonts w:ascii="Arial" w:hAnsi="Arial" w:cs="Arial"/>
+        </w:rPr>
+      </w:pPr>
+    </w:p>
+    <w:p>
+      <w:pPr>
+        <w:pStyle w:val="PargrafodaLista"/>
+        <w:spacing w:after="0" w:line="240" w:lineRule="auto"/>
+        <w:jc w:val="both"/>
+        <w:rPr>
+          <w:rFonts w:ascii="Arial" w:hAnsi="Arial" w:cs="Arial"/>
+        </w:rPr>
+      </w:pPr>
+      <w:r>
+        <w:rPr>
+          <w:rFonts w:ascii="Arial" w:hAnsi="Arial" w:cs="Arial"/>
+        </w:rPr>
+        <w:t xml:space="preserve">Seu respectivo símbolo é: </w:t>
+      </w:r>
+      <w:proofErr w:type="gramStart"/>
+      <w:r>
+        <w:rPr>
+          <w:rFonts w:ascii="Arial" w:hAnsi="Arial" w:cs="Arial"/>
+        </w:rPr>
+        <w:t>-( S )-</w:t>
+      </w:r>
+      <w:proofErr w:type="gramEnd"/>
     </w:p>
     <w:p>
       <w:pPr>
@@ -416,58 +545,123 @@
         </w:pBdr>
         <w:spacing w:after="0" w:line="240" w:lineRule="auto"/>
         <w:jc w:val="both"/>
-      </w:pPr>
-    </w:p>
-    <w:p>
-      <w:pPr>
-        <w:spacing w:after="0" w:line="240" w:lineRule="auto"/>
-        <w:jc w:val="both"/>
-      </w:pPr>
-    </w:p>
-    <w:p>
-      <w:pPr>
-        <w:spacing w:after="0" w:line="240" w:lineRule="auto"/>
-        <w:jc w:val="both"/>
-        <w:rPr>
+        <w:rPr>
+          <w:rFonts w:ascii="Arial" w:hAnsi="Arial" w:cs="Arial"/>
+        </w:rPr>
+      </w:pPr>
+    </w:p>
+    <w:p>
+      <w:pPr>
+        <w:spacing w:after="0" w:line="240" w:lineRule="auto"/>
+        <w:jc w:val="both"/>
+        <w:rPr>
+          <w:rFonts w:ascii="Arial" w:hAnsi="Arial" w:cs="Arial"/>
+        </w:rPr>
+      </w:pPr>
+    </w:p>
+    <w:p>
+      <w:pPr>
+        <w:pStyle w:val="PargrafodaLista"/>
+        <w:numPr>
+          <w:ilvl w:val="0"/>
+          <w:numId w:val="13"/>
+        </w:numPr>
+        <w:spacing w:after="0" w:line="240" w:lineRule="auto"/>
+        <w:jc w:val="both"/>
+        <w:rPr>
+          <w:rFonts w:ascii="Arial" w:hAnsi="Arial" w:cs="Arial"/>
+        </w:rPr>
+      </w:pPr>
+      <w:r>
+        <w:rPr>
+          <w:rFonts w:ascii="Arial" w:hAnsi="Arial" w:cs="Arial"/>
           <w:b/>
           <w:bCs/>
           <w:u w:val="single"/>
         </w:rPr>
-      </w:pPr>
-      <w:r>
-        <w:rPr>
+        <w:t>Bobina Reset em Ladder</w:t>
+      </w:r>
+      <w:r>
+        <w:rPr>
+          <w:rFonts w:ascii="Arial" w:hAnsi="Arial" w:cs="Arial"/>
           <w:b/>
           <w:bCs/>
           <w:u w:val="single"/>
         </w:rPr>
-        <w:t>Programa com temporizador:</w:t>
-      </w:r>
-    </w:p>
-    <w:p>
-      <w:pPr>
-        <w:spacing w:after="0" w:line="240" w:lineRule="auto"/>
-        <w:jc w:val="both"/>
-      </w:pPr>
-    </w:p>
-    <w:p>
-      <w:pPr>
-        <w:spacing w:after="0" w:line="240" w:lineRule="auto"/>
-        <w:jc w:val="both"/>
-      </w:pPr>
-      <w:r>
-        <w:t>O</w:t>
-      </w:r>
-      <w:r>
-        <w:t xml:space="preserve"> que é o TON e TOF</w:t>
-      </w:r>
-      <w:r>
-        <w:t>?</w:t>
-      </w:r>
-    </w:p>
-    <w:p>
-      <w:pPr>
-        <w:spacing w:after="0" w:line="240" w:lineRule="auto"/>
-        <w:jc w:val="both"/>
+        <w:t>:</w:t>
+      </w:r>
+      <w:r>
+        <w:rPr>
+          <w:rFonts w:ascii="Arial" w:hAnsi="Arial" w:cs="Arial"/>
+        </w:rPr>
+        <w:t xml:space="preserve"> </w:t>
+      </w:r>
+      <w:r>
+        <w:rPr>
+          <w:rFonts w:ascii="Arial" w:hAnsi="Arial" w:cs="Arial"/>
+        </w:rPr>
+        <w:t>É a instrução utilizada em conjunto com a Bobina Set. Ao ser acionada, ela quebra a retenção da memória e força o endereço de volta ao seu estado de repouso (Desativado - 0).</w:t>
+      </w:r>
+      <w:r>
+        <w:rPr>
+          <w:rFonts w:ascii="Arial" w:hAnsi="Arial" w:cs="Arial"/>
+        </w:rPr>
+        <w:t xml:space="preserve"> </w:t>
+      </w:r>
+    </w:p>
+    <w:p>
+      <w:pPr>
+        <w:pStyle w:val="PargrafodaLista"/>
+        <w:spacing w:after="0" w:line="240" w:lineRule="auto"/>
+        <w:jc w:val="both"/>
+        <w:rPr>
+          <w:rFonts w:ascii="Arial" w:hAnsi="Arial" w:cs="Arial"/>
+        </w:rPr>
+      </w:pPr>
+    </w:p>
+    <w:p>
+      <w:pPr>
+        <w:pStyle w:val="PargrafodaLista"/>
+        <w:spacing w:after="0" w:line="240" w:lineRule="auto"/>
+        <w:jc w:val="both"/>
+        <w:rPr>
+          <w:rFonts w:ascii="Arial" w:hAnsi="Arial" w:cs="Arial"/>
+        </w:rPr>
+      </w:pPr>
+      <w:r>
+        <w:rPr>
+          <w:rFonts w:ascii="Arial" w:hAnsi="Arial" w:cs="Arial"/>
+        </w:rPr>
+        <w:t xml:space="preserve">Seu respectivo símbolo é:  </w:t>
+      </w:r>
+      <w:proofErr w:type="gramStart"/>
+      <w:r>
+        <w:rPr>
+          <w:rFonts w:ascii="Arial" w:hAnsi="Arial" w:cs="Arial"/>
+        </w:rPr>
+        <w:t>-( R )-</w:t>
+      </w:r>
+      <w:proofErr w:type="gramEnd"/>
+    </w:p>
+    <w:p>
+      <w:pPr>
+        <w:pBdr>
+          <w:bottom w:val="single" w:sz="6" w:space="1" w:color="auto"/>
+        </w:pBdr>
+        <w:spacing w:after="0" w:line="240" w:lineRule="auto"/>
+        <w:jc w:val="both"/>
+        <w:rPr>
+          <w:rFonts w:ascii="Arial" w:hAnsi="Arial" w:cs="Arial"/>
+        </w:rPr>
+      </w:pPr>
+    </w:p>
+    <w:p>
+      <w:pPr>
+        <w:spacing w:after="0" w:line="240" w:lineRule="auto"/>
+        <w:jc w:val="both"/>
+        <w:rPr>
+          <w:rFonts w:ascii="Arial" w:hAnsi="Arial" w:cs="Arial"/>
+        </w:rPr>
       </w:pPr>
     </w:p>
     <w:p>
@@ -475,33 +669,67 @@
         <w:pStyle w:val="PargrafodaLista"/>
         <w:numPr>
           <w:ilvl w:val="0"/>
-          <w:numId w:val="12"/>
+          <w:numId w:val="13"/>
         </w:numPr>
         <w:spacing w:after="0" w:line="240" w:lineRule="auto"/>
         <w:jc w:val="both"/>
-      </w:pPr>
-      <w:r>
-        <w:rPr>
+        <w:rPr>
+          <w:rFonts w:ascii="Arial" w:hAnsi="Arial" w:cs="Arial"/>
+        </w:rPr>
+      </w:pPr>
+      <w:r>
+        <w:rPr>
+          <w:rFonts w:ascii="Arial" w:hAnsi="Arial" w:cs="Arial"/>
           <w:b/>
           <w:bCs/>
-        </w:rPr>
-        <w:t>TON (Timer On Delay - Atraso na Energização)</w:t>
-      </w:r>
-      <w:r>
-        <w:rPr>
+          <w:u w:val="single"/>
+        </w:rPr>
+        <w:t>Endereçamentos de Entrada (I0.0, I1.0, etc...)</w:t>
+      </w:r>
+      <w:r>
+        <w:rPr>
+          <w:rFonts w:ascii="Arial" w:hAnsi="Arial" w:cs="Arial"/>
           <w:b/>
           <w:bCs/>
+          <w:u w:val="single"/>
         </w:rPr>
         <w:t>:</w:t>
       </w:r>
       <w:r>
-        <w:t xml:space="preserve"> É um temporizador utilizado para esperar um numero definido de segundos, milissegundos, etc... após ser energizado para permitir a passagem de energia após o Contato NA ser acionado (após o início da simulação) ou NF (Manter igual após o início da simulação).</w:t>
-      </w:r>
-    </w:p>
-    <w:p>
-      <w:pPr>
-        <w:spacing w:after="0" w:line="240" w:lineRule="auto"/>
-        <w:jc w:val="both"/>
+        <w:rPr>
+          <w:rFonts w:ascii="Arial" w:hAnsi="Arial" w:cs="Arial"/>
+        </w:rPr>
+        <w:t xml:space="preserve"> </w:t>
+      </w:r>
+      <w:r>
+        <w:rPr>
+          <w:rFonts w:ascii="Arial" w:hAnsi="Arial" w:cs="Arial"/>
+        </w:rPr>
+        <w:t>Representam as entradas físicas (Inputs) do CLP mapeadas dentro do programa Ladder. São os endereços que recebem os sinais elétricos diretos de botões e sensores externos quando acionados em campo.</w:t>
+      </w:r>
+    </w:p>
+    <w:p>
+      <w:pPr>
+        <w:pBdr>
+          <w:bottom w:val="single" w:sz="6" w:space="1" w:color="auto"/>
+        </w:pBdr>
+        <w:spacing w:after="0" w:line="240" w:lineRule="auto"/>
+        <w:jc w:val="both"/>
+        <w:rPr>
+          <w:rFonts w:ascii="Arial" w:hAnsi="Arial" w:cs="Arial"/>
+        </w:rPr>
+      </w:pPr>
+    </w:p>
+    <w:p>
+      <w:pPr>
+        <w:spacing w:after="0" w:line="240" w:lineRule="auto"/>
+        <w:jc w:val="both"/>
+        <w:rPr>
+          <w:rFonts w:ascii="Arial" w:hAnsi="Arial" w:cs="Arial"/>
+          <w:b/>
+          <w:bCs/>
+          <w:u w:val="single"/>
+        </w:rPr>
       </w:pPr>
     </w:p>
     <w:p>
@@ -509,98 +737,43 @@
         <w:pStyle w:val="PargrafodaLista"/>
         <w:numPr>
           <w:ilvl w:val="0"/>
-          <w:numId w:val="12"/>
+          <w:numId w:val="13"/>
         </w:numPr>
         <w:spacing w:after="0" w:line="240" w:lineRule="auto"/>
         <w:jc w:val="both"/>
-      </w:pPr>
-      <w:r>
-        <w:rPr>
+        <w:rPr>
+          <w:rFonts w:ascii="Arial" w:hAnsi="Arial" w:cs="Arial"/>
+        </w:rPr>
+      </w:pPr>
+      <w:r>
+        <w:rPr>
+          <w:rFonts w:ascii="Arial" w:hAnsi="Arial" w:cs="Arial"/>
           <w:b/>
           <w:bCs/>
-        </w:rPr>
-        <w:lastRenderedPageBreak/>
-        <w:t>TOF (Timer Off Delay - Atraso na Desenergização)</w:t>
-      </w:r>
-      <w:r>
-        <w:rPr>
+          <w:u w:val="single"/>
+        </w:rPr>
+        <w:t>Endereçamentos de Saída (Q0.0, Q1.0, etc...)</w:t>
+      </w:r>
+      <w:r>
+        <w:rPr>
+          <w:rFonts w:ascii="Arial" w:hAnsi="Arial" w:cs="Arial"/>
           <w:b/>
           <w:bCs/>
+          <w:u w:val="single"/>
         </w:rPr>
         <w:t>:</w:t>
       </w:r>
       <w:r>
+        <w:rPr>
+          <w:rFonts w:ascii="Arial" w:hAnsi="Arial" w:cs="Arial"/>
+        </w:rPr>
         <w:t xml:space="preserve"> </w:t>
       </w:r>
       <w:r>
-        <w:t xml:space="preserve">É </w:t>
-      </w:r>
-      <w:r>
-        <w:t xml:space="preserve">o oposto do </w:t>
-      </w:r>
-      <w:r>
-        <w:rPr>
-          <w:b/>
-          <w:bCs/>
-        </w:rPr>
-        <w:t>TON</w:t>
-      </w:r>
-      <w:r>
-        <w:t xml:space="preserve">, </w:t>
-      </w:r>
-      <w:r>
-        <w:t>pois é</w:t>
-      </w:r>
-      <w:r>
-        <w:t xml:space="preserve"> </w:t>
-      </w:r>
-      <w:r>
-        <w:t>u</w:t>
-      </w:r>
-      <w:r>
-        <w:t xml:space="preserve">m temporizador utilizado para esperar um </w:t>
-      </w:r>
-      <w:r>
-        <w:t>número</w:t>
-      </w:r>
-      <w:r>
-        <w:t xml:space="preserve"> definido de segundos, milissegundos, etc... após ser </w:t>
-      </w:r>
-      <w:r>
-        <w:t>desenergizado</w:t>
-      </w:r>
-      <w:r>
-        <w:t xml:space="preserve"> para </w:t>
-      </w:r>
-      <w:r>
-        <w:t>impedir</w:t>
-      </w:r>
-      <w:r>
-        <w:t xml:space="preserve"> a passagem de energia após o Contato NA ser </w:t>
-      </w:r>
-      <w:r>
-        <w:t>desativado</w:t>
-      </w:r>
-      <w:r>
-        <w:t xml:space="preserve"> (</w:t>
-      </w:r>
-      <w:r>
-        <w:t>na simulação</w:t>
-      </w:r>
-      <w:r>
-        <w:t>) ou NF</w:t>
-      </w:r>
-      <w:r>
-        <w:t xml:space="preserve"> ser acionado</w:t>
-      </w:r>
-      <w:r>
-        <w:t xml:space="preserve"> (</w:t>
-      </w:r>
-      <w:r>
-        <w:t xml:space="preserve">na </w:t>
-      </w:r>
-      <w:r>
-        <w:t>simulação).</w:t>
+        <w:rPr>
+          <w:rFonts w:ascii="Arial" w:hAnsi="Arial" w:cs="Arial"/>
+        </w:rPr>
+        <w:t>Representam as saídas físicas (Outputs) do CLP no programa Ladder. São as instruções responsáveis por comandar os atuadores reais conectados ao CLP, tais como motores, lâmpadas e contatores.</w:t>
       </w:r>
     </w:p>
     <w:p>
@@ -610,7 +783,69 @@
         </w:pBdr>
         <w:spacing w:after="0" w:line="240" w:lineRule="auto"/>
         <w:jc w:val="both"/>
-      </w:pPr>
+        <w:rPr>
+          <w:rFonts w:ascii="Arial" w:hAnsi="Arial" w:cs="Arial"/>
+          <w:b/>
+          <w:bCs/>
+          <w:u w:val="single"/>
+        </w:rPr>
+      </w:pPr>
+    </w:p>
+    <w:p>
+      <w:pPr>
+        <w:spacing w:after="0" w:line="240" w:lineRule="auto"/>
+        <w:jc w:val="both"/>
+        <w:rPr>
+          <w:rFonts w:ascii="Arial" w:hAnsi="Arial" w:cs="Arial"/>
+          <w:b/>
+          <w:bCs/>
+          <w:u w:val="single"/>
+        </w:rPr>
+      </w:pPr>
+    </w:p>
+    <w:p>
+      <w:pPr>
+        <w:pStyle w:val="PargrafodaLista"/>
+        <w:numPr>
+          <w:ilvl w:val="0"/>
+          <w:numId w:val="13"/>
+        </w:numPr>
+        <w:spacing w:after="0" w:line="240" w:lineRule="auto"/>
+        <w:jc w:val="both"/>
+        <w:rPr>
+          <w:rFonts w:ascii="Arial" w:hAnsi="Arial" w:cs="Arial"/>
+        </w:rPr>
+      </w:pPr>
+      <w:r>
+        <w:rPr>
+          <w:rFonts w:ascii="Arial" w:hAnsi="Arial" w:cs="Arial"/>
+          <w:b/>
+          <w:bCs/>
+          <w:u w:val="single"/>
+        </w:rPr>
+        <w:t>Endereçamentos de Memória (M10.0, M11.0, etc...)</w:t>
+      </w:r>
+      <w:r>
+        <w:rPr>
+          <w:rFonts w:ascii="Arial" w:hAnsi="Arial" w:cs="Arial"/>
+          <w:b/>
+          <w:bCs/>
+          <w:u w:val="single"/>
+        </w:rPr>
+        <w:t>:</w:t>
+      </w:r>
+      <w:r>
+        <w:rPr>
+          <w:rFonts w:ascii="Arial" w:hAnsi="Arial" w:cs="Arial"/>
+        </w:rPr>
+        <w:t xml:space="preserve"> </w:t>
+      </w:r>
+      <w:r>
+        <w:rPr>
+          <w:rFonts w:ascii="Arial" w:hAnsi="Arial" w:cs="Arial"/>
+        </w:rPr>
+        <w:t>São bits de memória interna conhecidos como marcadores virtuais dentro da lógica Ladder. Funcionam como contatos ou bobinas internas para armazenar estados e ajudar no sequenciamento do código, sem necessitar de uma saída física direta.</w:t>
+      </w:r>
     </w:p>
     <w:p>
       <w:pPr>
@@ -619,37 +854,60 @@
         </w:pBdr>
         <w:spacing w:after="0" w:line="240" w:lineRule="auto"/>
         <w:jc w:val="both"/>
-      </w:pPr>
-    </w:p>
-    <w:p>
-      <w:pPr>
-        <w:spacing w:after="0" w:line="240" w:lineRule="auto"/>
-        <w:jc w:val="both"/>
-      </w:pPr>
-    </w:p>
-    <w:p>
-      <w:pPr>
-        <w:spacing w:after="0" w:line="240" w:lineRule="auto"/>
-        <w:jc w:val="both"/>
-        <w:rPr>
+        <w:rPr>
+          <w:rFonts w:ascii="Arial" w:hAnsi="Arial" w:cs="Arial"/>
+        </w:rPr>
+      </w:pPr>
+    </w:p>
+    <w:p>
+      <w:pPr>
+        <w:spacing w:after="0" w:line="240" w:lineRule="auto"/>
+        <w:jc w:val="both"/>
+        <w:rPr>
+          <w:rFonts w:ascii="Arial" w:hAnsi="Arial" w:cs="Arial"/>
           <w:b/>
           <w:bCs/>
           <w:u w:val="single"/>
         </w:rPr>
       </w:pPr>
-      <w:r>
-        <w:rPr>
+    </w:p>
+    <w:p>
+      <w:pPr>
+        <w:pStyle w:val="PargrafodaLista"/>
+        <w:numPr>
+          <w:ilvl w:val="0"/>
+          <w:numId w:val="13"/>
+        </w:numPr>
+        <w:spacing w:after="0" w:line="240" w:lineRule="auto"/>
+        <w:jc w:val="both"/>
+        <w:rPr>
+          <w:rFonts w:ascii="Arial" w:hAnsi="Arial" w:cs="Arial"/>
           <w:b/>
           <w:bCs/>
           <w:u w:val="single"/>
         </w:rPr>
-        <w:t>Passo-a-Passo da:</w:t>
-      </w:r>
-    </w:p>
-    <w:p>
-      <w:pPr>
-        <w:spacing w:after="0" w:line="240" w:lineRule="auto"/>
-        <w:jc w:val="both"/>
+      </w:pPr>
+      <w:r>
+        <w:rPr>
+          <w:rFonts w:ascii="Arial" w:hAnsi="Arial" w:cs="Arial"/>
+          <w:b/>
+          <w:bCs/>
+          <w:u w:val="single"/>
+        </w:rPr>
+        <w:t xml:space="preserve">Passo-a-Passo da: </w:t>
+      </w:r>
+    </w:p>
+    <w:p>
+      <w:pPr>
+        <w:pStyle w:val="PargrafodaLista"/>
+        <w:spacing w:after="0" w:line="240" w:lineRule="auto"/>
+        <w:jc w:val="both"/>
+        <w:rPr>
+          <w:rFonts w:ascii="Arial" w:hAnsi="Arial" w:cs="Arial"/>
+          <w:b/>
+          <w:bCs/>
+          <w:u w:val="single"/>
+        </w:rPr>
       </w:pPr>
     </w:p>
     <w:p>
@@ -657,16 +915,19 @@
         <w:pStyle w:val="PargrafodaLista"/>
         <w:numPr>
           <w:ilvl w:val="0"/>
-          <w:numId w:val="10"/>
+          <w:numId w:val="14"/>
         </w:numPr>
         <w:spacing w:after="0" w:line="240" w:lineRule="auto"/>
         <w:jc w:val="both"/>
-      </w:pPr>
-      <w:r>
-        <w:t>C</w:t>
-      </w:r>
-      <w:r>
-        <w:t>onfiguração do CLP</w:t>
+        <w:rPr>
+          <w:rFonts w:ascii="Arial" w:hAnsi="Arial" w:cs="Arial"/>
+        </w:rPr>
+      </w:pPr>
+      <w:r>
+        <w:rPr>
+          <w:rFonts w:ascii="Arial" w:hAnsi="Arial" w:cs="Arial"/>
+        </w:rPr>
+        <w:t xml:space="preserve">Configuração do CLP </w:t>
       </w:r>
     </w:p>
     <w:p>
@@ -674,21 +935,28 @@
         <w:pStyle w:val="PargrafodaLista"/>
         <w:numPr>
           <w:ilvl w:val="0"/>
-          <w:numId w:val="10"/>
+          <w:numId w:val="14"/>
         </w:numPr>
         <w:spacing w:after="0" w:line="240" w:lineRule="auto"/>
         <w:jc w:val="both"/>
-      </w:pPr>
-      <w:r>
-        <w:t>G</w:t>
-      </w:r>
-      <w:r>
-        <w:t>eração do programa</w:t>
-      </w:r>
-    </w:p>
-    <w:p>
-      <w:pPr>
-        <w:jc w:val="both"/>
+        <w:rPr>
+          <w:rFonts w:ascii="Arial" w:hAnsi="Arial" w:cs="Arial"/>
+        </w:rPr>
+      </w:pPr>
+      <w:r>
+        <w:rPr>
+          <w:rFonts w:ascii="Arial" w:hAnsi="Arial" w:cs="Arial"/>
+        </w:rPr>
+        <w:t xml:space="preserve">Geração do programa </w:t>
+      </w:r>
+    </w:p>
+    <w:p>
+      <w:pPr>
+        <w:spacing w:after="0" w:line="240" w:lineRule="auto"/>
+        <w:jc w:val="both"/>
+        <w:rPr>
+          <w:rFonts w:ascii="Arial" w:hAnsi="Arial" w:cs="Arial"/>
+        </w:rPr>
       </w:pPr>
     </w:p>
     <w:sectPr>
@@ -702,7 +970,7 @@
 </file>
 
 <file path=word/numbering.xml><?xml version="1.0" encoding="utf-8"?>
-<w:numbering xmlns:wpc="http://schemas.microsoft.com/office/word/2010/wordprocessingCanvas" xmlns:cx="http://schemas.microsoft.com/office/drawing/2014/chartex" xmlns:cx1="http://schemas.microsoft.com/office/drawing/2015/9/8/chartex" xmlns:cx2="http://schemas.microsoft.com/office/drawing/2015/10/21/chartex" xmlns:cx3="http://schemas.microsoft.com/office/drawing/2016/5/9/chartex" xmlns:cx4="http://schemas.microsoft.com/office/drawing/2016/5/10/chartex" xmlns:cx5="http://schemas.microsoft.com/office/drawing/2016/5/11/chartex" xmlns:cx6="http://schemas.microsoft.com/office/drawing/2016/5/12/chartex" xmlns:cx7="http://schemas.microsoft.com/office/drawing/2016/5/13/chartex" xmlns:cx8="http://schemas.microsoft.com/office/drawing/2016/5/14/chartex" xmlns:mc="http://schemas.openxmlformats.org/markup-compatibility/2006" xmlns:aink="http://schemas.microsoft.com/office/drawing/2016/ink" xmlns:am3d="http://schemas.microsoft.com/office/drawing/2017/model3d" xmlns:o="urn:schemas-microsoft-com:office:office" xmlns:oel="http://schemas.microsoft.com/office/2019/extlst" xmlns:r="http://schemas.openxmlformats.org/officeDocument/2006/relationships" xmlns:m="http://schemas.openxmlformats.org/officeDocument/2006/math" xmlns:v="urn:schemas-microsoft-com:vml" xmlns:wp14="http://schemas.microsoft.com/office/word/2010/wordprocessingDrawing" xmlns:wp="http://schemas.openxmlformats.org/drawingml/2006/wordprocessingDrawing" xmlns:w10="urn:schemas-microsoft-com:office:word" xmlns:w="http://schemas.openxmlformats.org/wordprocessingml/2006/main" xmlns:w14="http://schemas.microsoft.com/office/word/2010/wordml" xmlns:w15="http://schemas.microsoft.com/office/word/2012/wordml" xmlns:w16cex="http://schemas.microsoft.com/office/word/2018/wordml/cex" xmlns:w16cid="http://schemas.microsoft.com/office/word/2016/wordml/cid" xmlns:w16="http://schemas.microsoft.com/office/word/2018/wordml" xmlns:w16sdtdh="http://schemas.microsoft.com/office/word/2020/wordml/sdtdatahash" xmlns:w16se="http://schemas.microsoft.com/office/word/2015/wordml/symex" xmlns:wpg="http://schemas.microsoft.com/office/word/2010/wordprocessingGroup" xmlns:wpi="http://schemas.microsoft.com/office/word/2010/wordprocessingInk" xmlns:wne="http://schemas.microsoft.com/office/word/2006/wordml" xmlns:wps="http://schemas.microsoft.com/office/word/2010/wordprocessingShape" mc:Ignorable="w14 w15 w16se w16cid w16 w16cex w16sdtdh wp14">
+<w:numbering xmlns:wpc="http://schemas.microsoft.com/office/word/2010/wordprocessingCanvas" xmlns:cx="http://schemas.microsoft.com/office/drawing/2014/chartex" xmlns:cx1="http://schemas.microsoft.com/office/drawing/2015/9/8/chartex" xmlns:cx2="http://schemas.microsoft.com/office/drawing/2015/10/21/chartex" xmlns:cx3="http://schemas.microsoft.com/office/drawing/2016/5/9/chartex" xmlns:cx4="http://schemas.microsoft.com/office/drawing/2016/5/10/chartex" xmlns:cx5="http://schemas.microsoft.com/office/drawing/2016/5/11/chartex" xmlns:cx6="http://schemas.microsoft.com/office/drawing/2016/5/12/chartex" xmlns:cx7="http://schemas.microsoft.com/office/drawing/2016/5/13/chartex" xmlns:cx8="http://schemas.microsoft.com/office/drawing/2016/5/14/chartex" xmlns:mc="http://schemas.openxmlformats.org/markup-compatibility/2006" xmlns:aink="http://schemas.microsoft.com/office/drawing/2016/ink" xmlns:am3d="http://schemas.microsoft.com/office/drawing/2017/model3d" xmlns:o="urn:schemas-microsoft-com:office:office" xmlns:oel="http://schemas.microsoft.com/office/2019/extlst" xmlns:r="http://schemas.openxmlformats.org/officeDocument/2006/relationships" xmlns:m="http://schemas.openxmlformats.org/officeDocument/2006/math" xmlns:v="urn:schemas-microsoft-com:vml" xmlns:wp14="http://schemas.microsoft.com/office/word/2010/wordprocessingDrawing" xmlns:wp="http://schemas.openxmlformats.org/drawingml/2006/wordprocessingDrawing" xmlns:w10="urn:schemas-microsoft-com:office:word" xmlns:w="http://schemas.openxmlformats.org/wordprocessingml/2006/main" xmlns:w14="http://schemas.microsoft.com/office/word/2010/wordml" xmlns:w15="http://schemas.microsoft.com/office/word/2012/wordml" xmlns:w16cex="http://schemas.microsoft.com/office/word/2018/wordml/cex" xmlns:w16cid="http://schemas.microsoft.com/office/word/2016/wordml/cid" xmlns:w16="http://schemas.microsoft.com/office/word/2018/wordml" xmlns:w16du="http://schemas.microsoft.com/office/word/2023/wordml/word16du" xmlns:w16sdtdh="http://schemas.microsoft.com/office/word/2020/wordml/sdtdatahash" xmlns:w16sdtfl="http://schemas.microsoft.com/office/word/2024/wordml/sdtformatlock" xmlns:w16se="http://schemas.microsoft.com/office/word/2015/wordml/symex" xmlns:wpg="http://schemas.microsoft.com/office/word/2010/wordprocessingGroup" xmlns:wpi="http://schemas.microsoft.com/office/word/2010/wordprocessingInk" xmlns:wne="http://schemas.microsoft.com/office/word/2006/wordml" xmlns:wps="http://schemas.microsoft.com/office/word/2010/wordprocessingShape" mc:Ignorable="w14 w15 w16se w16cid w16 w16cex w16sdtdh w16sdtfl w16du wp14">
   <w:abstractNum w:abstractNumId="0" w15:restartNumberingAfterBreak="0">
     <w:nsid w:val="00000001"/>
     <w:multiLevelType w:val="hybridMultilevel"/>
@@ -1146,6 +1414,232 @@
     </w:lvl>
   </w:abstractNum>
   <w:abstractNum w:abstractNumId="7" w15:restartNumberingAfterBreak="0">
+    <w:nsid w:val="1D6F5B99"/>
+    <w:multiLevelType w:val="hybridMultilevel"/>
+    <w:tmpl w:val="7B90E7CC"/>
+    <w:lvl w:ilvl="0" w:tplc="04160003">
+      <w:start w:val="1"/>
+      <w:numFmt w:val="bullet"/>
+      <w:lvlText w:val="o"/>
+      <w:lvlJc w:val="left"/>
+      <w:pPr>
+        <w:ind w:left="1080" w:hanging="360"/>
+      </w:pPr>
+      <w:rPr>
+        <w:rFonts w:ascii="Courier New" w:hAnsi="Courier New" w:cs="Courier New" w:hint="default"/>
+      </w:rPr>
+    </w:lvl>
+    <w:lvl w:ilvl="1" w:tplc="04160003" w:tentative="1">
+      <w:start w:val="1"/>
+      <w:numFmt w:val="bullet"/>
+      <w:lvlText w:val="o"/>
+      <w:lvlJc w:val="left"/>
+      <w:pPr>
+        <w:ind w:left="1800" w:hanging="360"/>
+      </w:pPr>
+      <w:rPr>
+        <w:rFonts w:ascii="Courier New" w:hAnsi="Courier New" w:cs="Courier New" w:hint="default"/>
+      </w:rPr>
+    </w:lvl>
+    <w:lvl w:ilvl="2" w:tplc="04160005" w:tentative="1">
+      <w:start w:val="1"/>
+      <w:numFmt w:val="bullet"/>
+      <w:lvlText w:val=""/>
+      <w:lvlJc w:val="left"/>
+      <w:pPr>
+        <w:ind w:left="2520" w:hanging="360"/>
+      </w:pPr>
+      <w:rPr>
+        <w:rFonts w:ascii="Wingdings" w:hAnsi="Wingdings" w:hint="default"/>
+      </w:rPr>
+    </w:lvl>
+    <w:lvl w:ilvl="3" w:tplc="04160001" w:tentative="1">
+      <w:start w:val="1"/>
+      <w:numFmt w:val="bullet"/>
+      <w:lvlText w:val=""/>
+      <w:lvlJc w:val="left"/>
+      <w:pPr>
+        <w:ind w:left="3240" w:hanging="360"/>
+      </w:pPr>
+      <w:rPr>
+        <w:rFonts w:ascii="Symbol" w:hAnsi="Symbol" w:hint="default"/>
+      </w:rPr>
+    </w:lvl>
+    <w:lvl w:ilvl="4" w:tplc="04160003" w:tentative="1">
+      <w:start w:val="1"/>
+      <w:numFmt w:val="bullet"/>
+      <w:lvlText w:val="o"/>
+      <w:lvlJc w:val="left"/>
+      <w:pPr>
+        <w:ind w:left="3960" w:hanging="360"/>
+      </w:pPr>
+      <w:rPr>
+        <w:rFonts w:ascii="Courier New" w:hAnsi="Courier New" w:cs="Courier New" w:hint="default"/>
+      </w:rPr>
+    </w:lvl>
+    <w:lvl w:ilvl="5" w:tplc="04160005" w:tentative="1">
+      <w:start w:val="1"/>
+      <w:numFmt w:val="bullet"/>
+      <w:lvlText w:val=""/>
+      <w:lvlJc w:val="left"/>
+      <w:pPr>
+        <w:ind w:left="4680" w:hanging="360"/>
+      </w:pPr>
+      <w:rPr>
+        <w:rFonts w:ascii="Wingdings" w:hAnsi="Wingdings" w:hint="default"/>
+      </w:rPr>
+    </w:lvl>
+    <w:lvl w:ilvl="6" w:tplc="04160001" w:tentative="1">
+      <w:start w:val="1"/>
+      <w:numFmt w:val="bullet"/>
+      <w:lvlText w:val=""/>
+      <w:lvlJc w:val="left"/>
+      <w:pPr>
+        <w:ind w:left="5400" w:hanging="360"/>
+      </w:pPr>
+      <w:rPr>
+        <w:rFonts w:ascii="Symbol" w:hAnsi="Symbol" w:hint="default"/>
+      </w:rPr>
+    </w:lvl>
+    <w:lvl w:ilvl="7" w:tplc="04160003" w:tentative="1">
+      <w:start w:val="1"/>
+      <w:numFmt w:val="bullet"/>
+      <w:lvlText w:val="o"/>
+      <w:lvlJc w:val="left"/>
+      <w:pPr>
+        <w:ind w:left="6120" w:hanging="360"/>
+      </w:pPr>
+      <w:rPr>
+        <w:rFonts w:ascii="Courier New" w:hAnsi="Courier New" w:cs="Courier New" w:hint="default"/>
+      </w:rPr>
+    </w:lvl>
+    <w:lvl w:ilvl="8" w:tplc="04160005" w:tentative="1">
+      <w:start w:val="1"/>
+      <w:numFmt w:val="bullet"/>
+      <w:lvlText w:val=""/>
+      <w:lvlJc w:val="left"/>
+      <w:pPr>
+        <w:ind w:left="6840" w:hanging="360"/>
+      </w:pPr>
+      <w:rPr>
+        <w:rFonts w:ascii="Wingdings" w:hAnsi="Wingdings" w:hint="default"/>
+      </w:rPr>
+    </w:lvl>
+  </w:abstractNum>
+  <w:abstractNum w:abstractNumId="8" w15:restartNumberingAfterBreak="0">
+    <w:nsid w:val="34F02A6A"/>
+    <w:multiLevelType w:val="hybridMultilevel"/>
+    <w:tmpl w:val="6DEA2156"/>
+    <w:lvl w:ilvl="0" w:tplc="04160001">
+      <w:start w:val="1"/>
+      <w:numFmt w:val="bullet"/>
+      <w:lvlText w:val=""/>
+      <w:lvlJc w:val="left"/>
+      <w:pPr>
+        <w:ind w:left="720" w:hanging="360"/>
+      </w:pPr>
+      <w:rPr>
+        <w:rFonts w:ascii="Symbol" w:hAnsi="Symbol" w:hint="default"/>
+      </w:rPr>
+    </w:lvl>
+    <w:lvl w:ilvl="1" w:tplc="04160003" w:tentative="1">
+      <w:start w:val="1"/>
+      <w:numFmt w:val="bullet"/>
+      <w:lvlText w:val="o"/>
+      <w:lvlJc w:val="left"/>
+      <w:pPr>
+        <w:ind w:left="1440" w:hanging="360"/>
+      </w:pPr>
+      <w:rPr>
+        <w:rFonts w:ascii="Courier New" w:hAnsi="Courier New" w:cs="Courier New" w:hint="default"/>
+      </w:rPr>
+    </w:lvl>
+    <w:lvl w:ilvl="2" w:tplc="04160005" w:tentative="1">
+      <w:start w:val="1"/>
+      <w:numFmt w:val="bullet"/>
+      <w:lvlText w:val=""/>
+      <w:lvlJc w:val="left"/>
+      <w:pPr>
+        <w:ind w:left="2160" w:hanging="360"/>
+      </w:pPr>
+      <w:rPr>
+        <w:rFonts w:ascii="Wingdings" w:hAnsi="Wingdings" w:hint="default"/>
+      </w:rPr>
+    </w:lvl>
+    <w:lvl w:ilvl="3" w:tplc="04160001" w:tentative="1">
+      <w:start w:val="1"/>
+      <w:numFmt w:val="bullet"/>
+      <w:lvlText w:val=""/>
+      <w:lvlJc w:val="left"/>
+      <w:pPr>
+        <w:ind w:left="2880" w:hanging="360"/>
+      </w:pPr>
+      <w:rPr>
+        <w:rFonts w:ascii="Symbol" w:hAnsi="Symbol" w:hint="default"/>
+      </w:rPr>
+    </w:lvl>
+    <w:lvl w:ilvl="4" w:tplc="04160003" w:tentative="1">
+      <w:start w:val="1"/>
+      <w:numFmt w:val="bullet"/>
+      <w:lvlText w:val="o"/>
+      <w:lvlJc w:val="left"/>
+      <w:pPr>
+        <w:ind w:left="3600" w:hanging="360"/>
+      </w:pPr>
+      <w:rPr>
+        <w:rFonts w:ascii="Courier New" w:hAnsi="Courier New" w:cs="Courier New" w:hint="default"/>
+      </w:rPr>
+    </w:lvl>
+    <w:lvl w:ilvl="5" w:tplc="04160005" w:tentative="1">
+      <w:start w:val="1"/>
+      <w:numFmt w:val="bullet"/>
+      <w:lvlText w:val=""/>
+      <w:lvlJc w:val="left"/>
+      <w:pPr>
+        <w:ind w:left="4320" w:hanging="360"/>
+      </w:pPr>
+      <w:rPr>
+        <w:rFonts w:ascii="Wingdings" w:hAnsi="Wingdings" w:hint="default"/>
+      </w:rPr>
+    </w:lvl>
+    <w:lvl w:ilvl="6" w:tplc="04160001" w:tentative="1">
+      <w:start w:val="1"/>
+      <w:numFmt w:val="bullet"/>
+      <w:lvlText w:val=""/>
+      <w:lvlJc w:val="left"/>
+      <w:pPr>
+        <w:ind w:left="5040" w:hanging="360"/>
+      </w:pPr>
+      <w:rPr>
+        <w:rFonts w:ascii="Symbol" w:hAnsi="Symbol" w:hint="default"/>
+      </w:rPr>
+    </w:lvl>
+    <w:lvl w:ilvl="7" w:tplc="04160003" w:tentative="1">
+      <w:start w:val="1"/>
+      <w:numFmt w:val="bullet"/>
+      <w:lvlText w:val="o"/>
+      <w:lvlJc w:val="left"/>
+      <w:pPr>
+        <w:ind w:left="5760" w:hanging="360"/>
+      </w:pPr>
+      <w:rPr>
+        <w:rFonts w:ascii="Courier New" w:hAnsi="Courier New" w:cs="Courier New" w:hint="default"/>
+      </w:rPr>
+    </w:lvl>
+    <w:lvl w:ilvl="8" w:tplc="04160005" w:tentative="1">
+      <w:start w:val="1"/>
+      <w:numFmt w:val="bullet"/>
+      <w:lvlText w:val=""/>
+      <w:lvlJc w:val="left"/>
+      <w:pPr>
+        <w:ind w:left="6480" w:hanging="360"/>
+      </w:pPr>
+      <w:rPr>
+        <w:rFonts w:ascii="Wingdings" w:hAnsi="Wingdings" w:hint="default"/>
+      </w:rPr>
+    </w:lvl>
+  </w:abstractNum>
+  <w:abstractNum w:abstractNumId="9" w15:restartNumberingAfterBreak="0">
     <w:nsid w:val="42BE4712"/>
     <w:multiLevelType w:val="hybridMultilevel"/>
     <w:tmpl w:val="8D9412C0"/>
@@ -1233,7 +1727,7 @@
       </w:pPr>
     </w:lvl>
   </w:abstractNum>
-  <w:abstractNum w:abstractNumId="8" w15:restartNumberingAfterBreak="0">
+  <w:abstractNum w:abstractNumId="10" w15:restartNumberingAfterBreak="0">
     <w:nsid w:val="47FE1EC1"/>
     <w:multiLevelType w:val="hybridMultilevel"/>
     <w:tmpl w:val="38F0A37C"/>
@@ -1346,7 +1840,7 @@
       </w:rPr>
     </w:lvl>
   </w:abstractNum>
-  <w:abstractNum w:abstractNumId="9" w15:restartNumberingAfterBreak="0">
+  <w:abstractNum w:abstractNumId="11" w15:restartNumberingAfterBreak="0">
     <w:nsid w:val="495D29D7"/>
     <w:multiLevelType w:val="hybridMultilevel"/>
     <w:tmpl w:val="A6E66014"/>
@@ -1459,7 +1953,7 @@
       </w:rPr>
     </w:lvl>
   </w:abstractNum>
-  <w:abstractNum w:abstractNumId="10" w15:restartNumberingAfterBreak="0">
+  <w:abstractNum w:abstractNumId="12" w15:restartNumberingAfterBreak="0">
     <w:nsid w:val="64F714EE"/>
     <w:multiLevelType w:val="hybridMultilevel"/>
     <w:tmpl w:val="A4DE88A8"/>
@@ -1572,7 +2066,7 @@
       </w:rPr>
     </w:lvl>
   </w:abstractNum>
-  <w:abstractNum w:abstractNumId="11" w15:restartNumberingAfterBreak="0">
+  <w:abstractNum w:abstractNumId="13" w15:restartNumberingAfterBreak="0">
     <w:nsid w:val="75C14882"/>
     <w:multiLevelType w:val="hybridMultilevel"/>
     <w:tmpl w:val="19345D7E"/>
@@ -1707,25 +2201,31 @@
     <w:abstractNumId w:val="6"/>
   </w:num>
   <w:num w:numId="8" w16cid:durableId="619803343">
-    <w:abstractNumId w:val="7"/>
+    <w:abstractNumId w:val="9"/>
   </w:num>
   <w:num w:numId="9" w16cid:durableId="329144721">
-    <w:abstractNumId w:val="9"/>
+    <w:abstractNumId w:val="11"/>
   </w:num>
   <w:num w:numId="10" w16cid:durableId="1982424696">
+    <w:abstractNumId w:val="12"/>
+  </w:num>
+  <w:num w:numId="11" w16cid:durableId="394746854">
     <w:abstractNumId w:val="10"/>
   </w:num>
-  <w:num w:numId="11" w16cid:durableId="394746854">
+  <w:num w:numId="12" w16cid:durableId="429470692">
+    <w:abstractNumId w:val="13"/>
+  </w:num>
+  <w:num w:numId="13" w16cid:durableId="1045761055">
     <w:abstractNumId w:val="8"/>
   </w:num>
-  <w:num w:numId="12" w16cid:durableId="429470692">
-    <w:abstractNumId w:val="11"/>
+  <w:num w:numId="14" w16cid:durableId="1873879179">
+    <w:abstractNumId w:val="7"/>
   </w:num>
 </w:numbering>
 </file>
 
 <file path=word/styles.xml><?xml version="1.0" encoding="utf-8"?>
-<w:styles xmlns:mc="http://schemas.openxmlformats.org/markup-compatibility/2006" xmlns:r="http://schemas.openxmlformats.org/officeDocument/2006/relationships" xmlns:w="http://schemas.openxmlformats.org/wordprocessingml/2006/main" xmlns:w14="http://schemas.microsoft.com/office/word/2010/wordml" xmlns:w15="http://schemas.microsoft.com/office/word/2012/wordml" xmlns:w16cex="http://schemas.microsoft.com/office/word/2018/wordml/cex" xmlns:w16cid="http://schemas.microsoft.com/office/word/2016/wordml/cid" xmlns:w16="http://schemas.microsoft.com/office/word/2018/wordml" xmlns:w16sdtdh="http://schemas.microsoft.com/office/word/2020/wordml/sdtdatahash" xmlns:w16se="http://schemas.microsoft.com/office/word/2015/wordml/symex" mc:Ignorable="w14 w15 w16se w16cid w16 w16cex w16sdtdh">
+<w:styles xmlns:mc="http://schemas.openxmlformats.org/markup-compatibility/2006" xmlns:r="http://schemas.openxmlformats.org/officeDocument/2006/relationships" xmlns:w="http://schemas.openxmlformats.org/wordprocessingml/2006/main" xmlns:w14="http://schemas.microsoft.com/office/word/2010/wordml" xmlns:w15="http://schemas.microsoft.com/office/word/2012/wordml" xmlns:w16cex="http://schemas.microsoft.com/office/word/2018/wordml/cex" xmlns:w16cid="http://schemas.microsoft.com/office/word/2016/wordml/cid" xmlns:w16="http://schemas.microsoft.com/office/word/2018/wordml" xmlns:w16du="http://schemas.microsoft.com/office/word/2023/wordml/word16du" xmlns:w16sdtdh="http://schemas.microsoft.com/office/word/2020/wordml/sdtdatahash" xmlns:w16sdtfl="http://schemas.microsoft.com/office/word/2024/wordml/sdtformatlock" xmlns:w16se="http://schemas.microsoft.com/office/word/2015/wordml/symex" mc:Ignorable="w14 w15 w16se w16cid w16 w16cex w16sdtdh w16sdtfl w16du">
   <w:docDefaults>
     <w:rPrDefault>
       <w:rPr>

</xml_diff>

<commit_message>
Sexta Versão - Parte 03
</commit_message>
<xml_diff>
--- a/docs/tarefa_site_tia_portal.docx
+++ b/docs/tarefa_site_tia_portal.docx
@@ -13,7 +13,25 @@
           <w:color w:val="1F4E79"/>
           <w:sz w:val="36"/>
         </w:rPr>
-        <w:t>Tarefa Site – (TIA Portal V20)</w:t>
+        <w:t>Tarefa Site – (</w:t>
+      </w:r>
+      <w:bookmarkStart w:id="0" w:name="_Hlk234600874"/>
+      <w:r>
+        <w:rPr>
+          <w:b/>
+          <w:color w:val="1F4E79"/>
+          <w:sz w:val="36"/>
+        </w:rPr>
+        <w:t>TIA Portal V20</w:t>
+      </w:r>
+      <w:bookmarkEnd w:id="0"/>
+      <w:r>
+        <w:rPr>
+          <w:b/>
+          <w:color w:val="1F4E79"/>
+          <w:sz w:val="36"/>
+        </w:rPr>
+        <w:t>)</w:t>
       </w:r>
     </w:p>
     <w:p>
@@ -28,6 +46,86 @@
           <w:sz w:val="24"/>
         </w:rPr>
         <w:t>Explicar (+ Prints do programa Ladder):</w:t>
+      </w:r>
+    </w:p>
+    <w:p>
+      <w:pPr>
+        <w:keepNext/>
+        <w:pBdr>
+          <w:bottom w:val="single" w:sz="6" w:space="1" w:color="auto"/>
+        </w:pBdr>
+        <w:spacing w:after="0"/>
+        <w:rPr>
+          <w:b/>
+          <w:color w:val="2E74B5"/>
+          <w:sz w:val="26"/>
+        </w:rPr>
+      </w:pPr>
+    </w:p>
+    <w:p>
+      <w:pPr>
+        <w:keepNext/>
+        <w:pBdr>
+          <w:bottom w:val="single" w:sz="6" w:space="1" w:color="auto"/>
+        </w:pBdr>
+        <w:spacing w:after="0"/>
+        <w:rPr>
+          <w:b/>
+          <w:color w:val="2E74B5"/>
+          <w:sz w:val="26"/>
+        </w:rPr>
+      </w:pPr>
+    </w:p>
+    <w:p>
+      <w:pPr>
+        <w:keepNext/>
+        <w:spacing w:after="0"/>
+        <w:rPr>
+          <w:b/>
+          <w:color w:val="2E74B5"/>
+          <w:sz w:val="26"/>
+        </w:rPr>
+      </w:pPr>
+    </w:p>
+    <w:p>
+      <w:pPr>
+        <w:keepNext/>
+        <w:spacing w:after="0"/>
+        <w:rPr>
+          <w:b/>
+          <w:color w:val="2E74B5"/>
+          <w:sz w:val="26"/>
+        </w:rPr>
+      </w:pPr>
+      <w:r>
+        <w:rPr>
+          <w:b/>
+          <w:color w:val="2E74B5"/>
+          <w:sz w:val="26"/>
+        </w:rPr>
+        <w:t>TIA Portal V20</w:t>
+      </w:r>
+    </w:p>
+    <w:p>
+      <w:pPr>
+        <w:keepNext/>
+        <w:spacing w:after="0"/>
+      </w:pPr>
+    </w:p>
+    <w:p>
+      <w:pPr>
+        <w:spacing w:after="0"/>
+        <w:rPr>
+          <w:rFonts w:ascii="Consolas" w:hAnsi="Consolas"/>
+          <w:b/>
+          <w:color w:val="C00000"/>
+        </w:rPr>
+      </w:pPr>
+      <w:r>
+        <w:rPr>
+          <w:sz w:val="21"/>
+        </w:rPr>
+        <w:t>É um software de engenharia de automação industrial desenvolvido pela Siemens que integra diversas ferramentas em um único ambiente. Ele é utilizado para programar Controladores Lógicos Programáveis (CLPs) em linguagens como o Ladder, criar telas de operação (IHM), configurar redes industriais e simular o funcionamento lógico do código antes de sua aplicação em equipamentos reais.</w:t>
       </w:r>
     </w:p>
     <w:p>
@@ -121,7 +219,31 @@
           <w:b/>
           <w:color w:val="C00000"/>
         </w:rPr>
-        <w:t xml:space="preserve">  |  |</w:t>
+        <w:t xml:space="preserve">  </w:t>
+      </w:r>
+      <w:r>
+        <w:rPr>
+          <w:rFonts w:ascii="Consolas" w:hAnsi="Consolas"/>
+          <w:b/>
+          <w:color w:val="C00000"/>
+        </w:rPr>
+        <w:t>-</w:t>
+      </w:r>
+      <w:r>
+        <w:rPr>
+          <w:rFonts w:ascii="Consolas" w:hAnsi="Consolas"/>
+          <w:b/>
+          <w:color w:val="C00000"/>
+        </w:rPr>
+        <w:t>|  |</w:t>
+      </w:r>
+      <w:r>
+        <w:rPr>
+          <w:rFonts w:ascii="Consolas" w:hAnsi="Consolas"/>
+          <w:b/>
+          <w:color w:val="C00000"/>
+        </w:rPr>
+        <w:t>-</w:t>
       </w:r>
     </w:p>
     <w:p>
@@ -220,7 +342,31 @@
           <w:b/>
           <w:color w:val="C00000"/>
         </w:rPr>
-        <w:t xml:space="preserve">  | / |</w:t>
+        <w:t xml:space="preserve">  </w:t>
+      </w:r>
+      <w:r>
+        <w:rPr>
+          <w:rFonts w:ascii="Consolas" w:hAnsi="Consolas"/>
+          <w:b/>
+          <w:color w:val="C00000"/>
+        </w:rPr>
+        <w:t>-</w:t>
+      </w:r>
+      <w:r>
+        <w:rPr>
+          <w:rFonts w:ascii="Consolas" w:hAnsi="Consolas"/>
+          <w:b/>
+          <w:color w:val="C00000"/>
+        </w:rPr>
+        <w:t>| / |</w:t>
+      </w:r>
+      <w:r>
+        <w:rPr>
+          <w:rFonts w:ascii="Consolas" w:hAnsi="Consolas"/>
+          <w:b/>
+          <w:color w:val="C00000"/>
+        </w:rPr>
+        <w:t>-</w:t>
       </w:r>
     </w:p>
     <w:p>
@@ -230,9 +376,7 @@
         </w:pBdr>
         <w:spacing w:after="0"/>
         <w:rPr>
-          <w:rFonts w:ascii="Consolas" w:hAnsi="Consolas"/>
-          <w:b/>
-          <w:color w:val="C00000"/>
+          <w:sz w:val="21"/>
         </w:rPr>
       </w:pPr>
     </w:p>
@@ -257,25 +401,23 @@
           <w:color w:val="2E74B5"/>
           <w:sz w:val="26"/>
         </w:rPr>
-        <w:t xml:space="preserve">TON (Timer </w:t>
+        <w:t>Bobina</w:t>
       </w:r>
-      <w:proofErr w:type="gramStart"/>
       <w:r>
         <w:rPr>
           <w:b/>
           <w:color w:val="2E74B5"/>
           <w:sz w:val="26"/>
         </w:rPr>
-        <w:t>On</w:t>
+        <w:t xml:space="preserve"> </w:t>
       </w:r>
-      <w:proofErr w:type="gramEnd"/>
       <w:r>
         <w:rPr>
           <w:b/>
           <w:color w:val="2E74B5"/>
           <w:sz w:val="26"/>
         </w:rPr>
-        <w:t xml:space="preserve"> Delay - Atraso na Energização) em Ladder</w:t>
+        <w:t>em Ladder</w:t>
       </w:r>
     </w:p>
     <w:p>
@@ -295,115 +437,37 @@
         <w:rPr>
           <w:sz w:val="21"/>
         </w:rPr>
-        <w:t>É um temporizador utilizado para esperar um número definido de segundos, milissegundos, etc... após ser energizado para permitir a passagem de energia após o Contato NA ser acionado ou NF ser mantido em seu estado.</w:t>
+        <w:t>É a instrução de saída padrão na linguagem Ladder. Quando há continuidade lógica (passagem de corrente) por toda a linha de contatos que a antecede, a bobina é ativada. Assim que essa continuidade é interrompida, ela retorna imediatamente ao seu estado de repouso (Desativado - 0).</w:t>
       </w:r>
     </w:p>
     <w:p>
       <w:pPr>
-        <w:pBdr>
-          <w:bottom w:val="single" w:sz="6" w:space="1" w:color="auto"/>
-        </w:pBdr>
+        <w:spacing w:after="0"/>
+      </w:pPr>
+    </w:p>
+    <w:p>
+      <w:pPr>
         <w:spacing w:after="0"/>
         <w:rPr>
-          <w:sz w:val="21"/>
-        </w:rPr>
-      </w:pPr>
-    </w:p>
-    <w:p>
-      <w:pPr>
-        <w:spacing w:after="0"/>
-      </w:pPr>
-    </w:p>
-    <w:p>
-      <w:pPr>
-        <w:keepNext/>
-        <w:spacing w:after="0"/>
-        <w:rPr>
+          <w:rFonts w:ascii="Consolas" w:hAnsi="Consolas"/>
           <w:b/>
-          <w:color w:val="2E74B5"/>
-          <w:sz w:val="26"/>
+          <w:color w:val="C00000"/>
         </w:rPr>
       </w:pPr>
       <w:r>
         <w:rPr>
           <w:b/>
-          <w:color w:val="2E74B5"/>
-          <w:sz w:val="26"/>
-        </w:rPr>
-        <w:t>TOF (Timer Off Delay - Atraso na Desenergização) em Ladder</w:t>
-      </w:r>
-    </w:p>
-    <w:p>
-      <w:pPr>
-        <w:keepNext/>
-        <w:spacing w:after="0"/>
-      </w:pPr>
-    </w:p>
-    <w:p>
-      <w:pPr>
-        <w:spacing w:after="0"/>
-        <w:rPr>
           <w:sz w:val="21"/>
         </w:rPr>
-      </w:pPr>
+        <w:t xml:space="preserve">Seu respectivo símbolo é: </w:t>
+      </w:r>
       <w:r>
         <w:rPr>
-          <w:sz w:val="21"/>
+          <w:rFonts w:ascii="Consolas" w:hAnsi="Consolas"/>
+          <w:b/>
+          <w:color w:val="C00000"/>
         </w:rPr>
-        <w:t>É o oposto do TON, pois é um temporizador utilizado para esperar um número definido de segundos, milissegundos, etc... após ser desenergizado para impedir a passagem de energia após o Contato NA ser desativado ou NF ser acionado.</w:t>
-      </w:r>
-    </w:p>
-    <w:p>
-      <w:pPr>
-        <w:pBdr>
-          <w:bottom w:val="single" w:sz="6" w:space="1" w:color="auto"/>
-        </w:pBdr>
-        <w:spacing w:after="0"/>
-      </w:pPr>
-    </w:p>
-    <w:p>
-      <w:pPr>
-        <w:spacing w:after="0"/>
-      </w:pPr>
-    </w:p>
-    <w:p>
-      <w:pPr>
-        <w:keepNext/>
-        <w:spacing w:after="0"/>
-        <w:rPr>
-          <w:b/>
-          <w:color w:val="2E74B5"/>
-          <w:sz w:val="26"/>
-        </w:rPr>
-      </w:pPr>
-      <w:r>
-        <w:rPr>
-          <w:b/>
-          <w:color w:val="2E74B5"/>
-          <w:sz w:val="26"/>
-        </w:rPr>
-        <w:lastRenderedPageBreak/>
-        <w:t>TP (Timer Pulse - Temporizador de Pulso) em Ladder</w:t>
-      </w:r>
-    </w:p>
-    <w:p>
-      <w:pPr>
-        <w:keepNext/>
-        <w:spacing w:after="0"/>
-      </w:pPr>
-    </w:p>
-    <w:p>
-      <w:pPr>
-        <w:spacing w:after="0"/>
-        <w:rPr>
-          <w:sz w:val="21"/>
-        </w:rPr>
-      </w:pPr>
-      <w:r>
-        <w:rPr>
-          <w:sz w:val="21"/>
-        </w:rPr>
-        <w:t>É um temporizador utilizado para gerar uma saída ativa por um período de tempo predefinido exato. Assim que recebe um pulso na entrada, a sua saída é ligada e o tempo começa a contar, permanecendo ativa mesmo que o sinal de entrada seja desativado antes do tempo terminar. Após o fim do tempo programado, a saída desliga automaticamente.</w:t>
+        <w:t xml:space="preserve">  -(  )-</w:t>
       </w:r>
     </w:p>
     <w:p>
@@ -545,21 +609,7 @@
         <w:rPr>
           <w:sz w:val="21"/>
         </w:rPr>
-        <w:t xml:space="preserve">É </w:t>
-      </w:r>
-      <w:proofErr w:type="gramStart"/>
-      <w:r>
-        <w:rPr>
-          <w:sz w:val="21"/>
-        </w:rPr>
-        <w:t>a</w:t>
-      </w:r>
-      <w:proofErr w:type="gramEnd"/>
-      <w:r>
-        <w:rPr>
-          <w:sz w:val="21"/>
-        </w:rPr>
-        <w:t xml:space="preserve"> instrução utilizada em conjunto com a Bobina Set. Ao ser acionada, ela quebra a retenção da memória e força o endereço de volta ao seu estado de repouso (Desativado - 0).</w:t>
+        <w:t>É a instrução utilizada em conjunto com a Bobina Set. Ao ser acionada, ela quebra a retenção da memória e força o endereço de volta ao seu estado de repouso (Desativado - 0).</w:t>
       </w:r>
     </w:p>
     <w:p>
@@ -626,6 +676,171 @@
           <w:color w:val="2E74B5"/>
           <w:sz w:val="26"/>
         </w:rPr>
+        <w:t>TON (Timer On Delay - Atraso na Energização) em Ladder</w:t>
+      </w:r>
+    </w:p>
+    <w:p>
+      <w:pPr>
+        <w:keepNext/>
+        <w:spacing w:after="0"/>
+      </w:pPr>
+    </w:p>
+    <w:p>
+      <w:pPr>
+        <w:spacing w:after="0"/>
+        <w:rPr>
+          <w:sz w:val="21"/>
+        </w:rPr>
+      </w:pPr>
+      <w:r>
+        <w:rPr>
+          <w:sz w:val="21"/>
+        </w:rPr>
+        <w:t>É um temporizador utilizado para esperar um número definido de segundos, milissegundos, etc... após ser energizado para permitir a passagem de energia após o Contato NA ser acionado ou NF ser mantido em seu estado.</w:t>
+      </w:r>
+    </w:p>
+    <w:p>
+      <w:pPr>
+        <w:pBdr>
+          <w:bottom w:val="single" w:sz="6" w:space="1" w:color="auto"/>
+        </w:pBdr>
+        <w:spacing w:after="0"/>
+        <w:rPr>
+          <w:sz w:val="21"/>
+        </w:rPr>
+      </w:pPr>
+    </w:p>
+    <w:p>
+      <w:pPr>
+        <w:spacing w:after="0"/>
+      </w:pPr>
+    </w:p>
+    <w:p>
+      <w:pPr>
+        <w:keepNext/>
+        <w:spacing w:after="0"/>
+        <w:rPr>
+          <w:b/>
+          <w:color w:val="2E74B5"/>
+          <w:sz w:val="26"/>
+        </w:rPr>
+      </w:pPr>
+      <w:r>
+        <w:rPr>
+          <w:b/>
+          <w:color w:val="2E74B5"/>
+          <w:sz w:val="26"/>
+        </w:rPr>
+        <w:t>TOF (Timer Off Delay - Atraso na Desenergização) em Ladder</w:t>
+      </w:r>
+    </w:p>
+    <w:p>
+      <w:pPr>
+        <w:keepNext/>
+        <w:spacing w:after="0"/>
+      </w:pPr>
+    </w:p>
+    <w:p>
+      <w:pPr>
+        <w:spacing w:after="0"/>
+        <w:rPr>
+          <w:sz w:val="21"/>
+        </w:rPr>
+      </w:pPr>
+      <w:r>
+        <w:rPr>
+          <w:sz w:val="21"/>
+        </w:rPr>
+        <w:t>É o oposto do TON, pois é um temporizador utilizado para esperar um número definido de segundos, milissegundos, etc... após ser desenergizado para impedir a passagem de energia após o Contato NA ser desativado ou NF ser acionado.</w:t>
+      </w:r>
+    </w:p>
+    <w:p>
+      <w:pPr>
+        <w:pBdr>
+          <w:bottom w:val="single" w:sz="6" w:space="1" w:color="auto"/>
+        </w:pBdr>
+        <w:spacing w:after="0"/>
+      </w:pPr>
+    </w:p>
+    <w:p>
+      <w:pPr>
+        <w:spacing w:after="0"/>
+      </w:pPr>
+    </w:p>
+    <w:p>
+      <w:pPr>
+        <w:keepNext/>
+        <w:spacing w:after="0"/>
+        <w:rPr>
+          <w:b/>
+          <w:color w:val="2E74B5"/>
+          <w:sz w:val="26"/>
+        </w:rPr>
+      </w:pPr>
+      <w:r>
+        <w:rPr>
+          <w:b/>
+          <w:color w:val="2E74B5"/>
+          <w:sz w:val="26"/>
+        </w:rPr>
+        <w:t>TP (Timer Pulse - Temporizador de Pulso) em Ladder</w:t>
+      </w:r>
+    </w:p>
+    <w:p>
+      <w:pPr>
+        <w:keepNext/>
+        <w:spacing w:after="0"/>
+      </w:pPr>
+    </w:p>
+    <w:p>
+      <w:pPr>
+        <w:spacing w:after="0"/>
+        <w:rPr>
+          <w:sz w:val="21"/>
+        </w:rPr>
+      </w:pPr>
+      <w:r>
+        <w:rPr>
+          <w:sz w:val="21"/>
+        </w:rPr>
+        <w:t>É um temporizador utilizado para gerar uma saída ativa por um período de tempo predefinido exato. Assim que recebe um pulso na entrada, a sua saída é ligada e o tempo começa a contar, permanecendo ativa mesmo que o sinal de entrada seja desativado antes do tempo terminar. Após o fim do tempo programado, a saída desliga automaticamente.</w:t>
+      </w:r>
+    </w:p>
+    <w:p>
+      <w:pPr>
+        <w:pBdr>
+          <w:bottom w:val="single" w:sz="6" w:space="1" w:color="auto"/>
+        </w:pBdr>
+        <w:spacing w:after="0"/>
+        <w:rPr>
+          <w:rFonts w:ascii="Consolas" w:hAnsi="Consolas"/>
+          <w:b/>
+          <w:color w:val="C00000"/>
+        </w:rPr>
+      </w:pPr>
+    </w:p>
+    <w:p>
+      <w:pPr>
+        <w:spacing w:after="0"/>
+      </w:pPr>
+    </w:p>
+    <w:p>
+      <w:pPr>
+        <w:keepNext/>
+        <w:spacing w:after="0"/>
+        <w:rPr>
+          <w:b/>
+          <w:color w:val="2E74B5"/>
+          <w:sz w:val="26"/>
+        </w:rPr>
+      </w:pPr>
+      <w:r>
+        <w:rPr>
+          <w:b/>
+          <w:color w:val="2E74B5"/>
+          <w:sz w:val="26"/>
+        </w:rPr>
+        <w:lastRenderedPageBreak/>
         <w:t>CTU (Count Up - Contador Crescente) em Ladder</w:t>
       </w:r>
     </w:p>
@@ -736,7 +951,6 @@
           <w:color w:val="2E74B5"/>
           <w:sz w:val="26"/>
         </w:rPr>
-        <w:lastRenderedPageBreak/>
         <w:t>Endereçamentos de Entrada em Ladder (I0.0, I1.0, etc...)</w:t>
       </w:r>
     </w:p>
@@ -1755,7 +1969,6 @@
   <w:style w:type="character" w:default="1" w:styleId="Fontepargpadro">
     <w:name w:val="Default Paragraph Font"/>
     <w:uiPriority w:val="1"/>
-    <w:semiHidden/>
     <w:unhideWhenUsed/>
   </w:style>
   <w:style w:type="table" w:default="1" w:styleId="Tabelanormal">

</xml_diff>